<commit_message>
updated nav bar and added imgs to footer
</commit_message>
<xml_diff>
--- a/games/2d Games/Unity Games/Echoes of the Hero/Documentation/Game.docx
+++ b/games/2d Games/Unity Games/Echoes of the Hero/Documentation/Game.docx
@@ -1322,6 +1322,11 @@
     </w:p>
     <w:p>
       <w:r>
+        <w:t>Passive:</w:t>
+      </w:r>
+    </w:p>
+    <w:p>
+      <w:r>
         <w:t>Weapon: Cross Staff</w:t>
       </w:r>
     </w:p>
@@ -1398,17 +1403,12 @@
     <w:p/>
     <w:p/>
     <w:p/>
-    <w:p/>
-    <w:p/>
-    <w:p/>
-    <w:p/>
-    <w:p/>
-    <w:p/>
     <w:p>
       <w:pPr>
         <w:pStyle w:val="Heading2"/>
       </w:pPr>
       <w:r>
+        <w:lastRenderedPageBreak/>
         <w:t>D</w:t>
       </w:r>
       <w:r>
@@ -1544,14 +1544,12 @@
     <w:p/>
     <w:p/>
     <w:p/>
-    <w:p/>
-    <w:p/>
-    <w:p/>
     <w:p>
       <w:pPr>
         <w:pStyle w:val="Heading2"/>
       </w:pPr>
       <w:r>
+        <w:lastRenderedPageBreak/>
         <w:t>F</w:t>
       </w:r>
       <w:r>
@@ -1642,9 +1640,6 @@
           <w:bCs/>
         </w:rPr>
         <w:br/>
-      </w:r>
-      <w:r>
-        <w:t>Increases the damage of spirit attacks and their attack speed.</w:t>
       </w:r>
     </w:p>
     <w:p>
@@ -1733,7 +1728,6 @@
           <w:b/>
           <w:bCs/>
         </w:rPr>
-        <w:lastRenderedPageBreak/>
         <w:t>A Divine Smite that is the fusion result of the Smite ability fused with the Cleric’s Spiritual Weapon.</w:t>
       </w:r>
     </w:p>
@@ -1847,6 +1841,7 @@
           <w:b/>
           <w:bCs/>
         </w:rPr>
+        <w:lastRenderedPageBreak/>
         <w:t>Shield Guard + Buff Ability</w:t>
       </w:r>
     </w:p>
@@ -2010,7 +2005,6 @@
         <w:pStyle w:val="Heading2"/>
       </w:pPr>
       <w:r>
-        <w:lastRenderedPageBreak/>
         <w:t>R</w:t>
       </w:r>
       <w:r>
@@ -2069,6 +2063,7 @@
     </w:p>
     <w:p>
       <w:r>
+        <w:lastRenderedPageBreak/>
         <w:t>Support</w:t>
       </w:r>
     </w:p>
@@ -2207,6 +2202,17 @@
     </w:p>
     <w:p>
       <w:r>
+        <w:t>D</w:t>
+      </w:r>
+      <w:r>
+        <w:t>escription</w:t>
+      </w:r>
+      <w:r>
+        <w:t>:</w:t>
+      </w:r>
+    </w:p>
+    <w:p>
+      <w:r>
         <w:t>Weapon: Staff</w:t>
       </w:r>
     </w:p>
@@ -2272,7 +2278,6 @@
         </w:numPr>
       </w:pPr>
       <w:r>
-        <w:lastRenderedPageBreak/>
         <w:t>Ice Storm: Slows enemies in its radius and has a chance to freeze the enemy.</w:t>
       </w:r>
     </w:p>
@@ -2286,9 +2291,12 @@
       <w:r>
         <w:t xml:space="preserve">Thunder Zap: </w:t>
       </w:r>
+      <w:r>
+        <w:t xml:space="preserve">shoots a lightning bolt that chains on enemies and </w:t>
+      </w:r>
       <w:proofErr w:type="spellStart"/>
       <w:r>
-        <w:t>Paralyzes</w:t>
+        <w:t>paralyzes</w:t>
       </w:r>
       <w:proofErr w:type="spellEnd"/>
       <w:r>
@@ -2438,7 +2446,6 @@
           <w:b/>
           <w:bCs/>
         </w:rPr>
-        <w:lastRenderedPageBreak/>
         <w:t>Attacks</w:t>
       </w:r>
     </w:p>
@@ -2668,6 +2675,7 @@
         <w:pStyle w:val="ListParagraph"/>
       </w:pPr>
       <w:r>
+        <w:lastRenderedPageBreak/>
         <w:t>Slows enemies</w:t>
       </w:r>
     </w:p>

</xml_diff>

<commit_message>
Added to Lich king section
lore,description,some attaks, intro,phase transition
</commit_message>
<xml_diff>
--- a/games/2d Games/Unity Games/Echoes of the Hero/Documentation/Game.docx
+++ b/games/2d Games/Unity Games/Echoes of the Hero/Documentation/Game.docx
@@ -3,16 +3,10 @@
 <w:document xmlns:wpc="http://schemas.microsoft.com/office/word/2010/wordprocessingCanvas" xmlns:cx="http://schemas.microsoft.com/office/drawing/2014/chartex" xmlns:cx1="http://schemas.microsoft.com/office/drawing/2015/9/8/chartex" xmlns:cx2="http://schemas.microsoft.com/office/drawing/2015/10/21/chartex" xmlns:cx3="http://schemas.microsoft.com/office/drawing/2016/5/9/chartex" xmlns:cx4="http://schemas.microsoft.com/office/drawing/2016/5/10/chartex" xmlns:cx5="http://schemas.microsoft.com/office/drawing/2016/5/11/chartex" xmlns:cx6="http://schemas.microsoft.com/office/drawing/2016/5/12/chartex" xmlns:cx7="http://schemas.microsoft.com/office/drawing/2016/5/13/chartex" xmlns:cx8="http://schemas.microsoft.com/office/drawing/2016/5/14/chartex" xmlns:mc="http://schemas.openxmlformats.org/markup-compatibility/2006" xmlns:aink="http://schemas.microsoft.com/office/drawing/2016/ink" xmlns:am3d="http://schemas.microsoft.com/office/drawing/2017/model3d" xmlns:o="urn:schemas-microsoft-com:office:office" xmlns:oel="http://schemas.microsoft.com/office/2019/extlst" xmlns:r="http://schemas.openxmlformats.org/officeDocument/2006/relationships" xmlns:m="http://schemas.openxmlformats.org/officeDocument/2006/math" xmlns:v="urn:schemas-microsoft-com:vml" xmlns:wp14="http://schemas.microsoft.com/office/word/2010/wordprocessingDrawing" xmlns:wp="http://schemas.openxmlformats.org/drawingml/2006/wordprocessingDrawing" xmlns:w10="urn:schemas-microsoft-com:office:word" xmlns:w="http://schemas.openxmlformats.org/wordprocessingml/2006/main" xmlns:w14="http://schemas.microsoft.com/office/word/2010/wordml" xmlns:w15="http://schemas.microsoft.com/office/word/2012/wordml" xmlns:w16cex="http://schemas.microsoft.com/office/word/2018/wordml/cex" xmlns:w16cid="http://schemas.microsoft.com/office/word/2016/wordml/cid" xmlns:w16="http://schemas.microsoft.com/office/word/2018/wordml" xmlns:w16du="http://schemas.microsoft.com/office/word/2023/wordml/word16du" xmlns:w16sdtdh="http://schemas.microsoft.com/office/word/2020/wordml/sdtdatahash" xmlns:w16sdtfl="http://schemas.microsoft.com/office/word/2024/wordml/sdtformatlock" xmlns:w16se="http://schemas.microsoft.com/office/word/2015/wordml/symex" xmlns:wpg="http://schemas.microsoft.com/office/word/2010/wordprocessingGroup" xmlns:wpi="http://schemas.microsoft.com/office/word/2010/wordprocessingInk" xmlns:wne="http://schemas.microsoft.com/office/word/2006/wordml" xmlns:wps="http://schemas.microsoft.com/office/word/2010/wordprocessingShape" mc:Ignorable="w14 w15 w16se w16cid w16 w16cex w16sdtdh w16sdtfl w16du wp14">
   <w:body>
     <w:p>
-      <w:r>
-        <w:t>Unity Game Concept</w:t>
-      </w:r>
-    </w:p>
-    <w:p>
       <w:pPr>
         <w:pStyle w:val="Heading1"/>
       </w:pPr>
       <w:r>
-        <w:lastRenderedPageBreak/>
         <w:t>Intro</w:t>
       </w:r>
     </w:p>
@@ -4269,33 +4263,1965 @@
       </w:r>
     </w:p>
     <w:p>
-      <w:r>
-        <w:t>Final Boss: Lich riding the Skeletal Dragon King (inspired by the Dragon King fight)</w:t>
-      </w:r>
-    </w:p>
-    <w:p>
-      <w:r>
-        <w:t>Boss Phases:</w:t>
-      </w:r>
-    </w:p>
-    <w:p/>
-    <w:p>
-      <w:r>
-        <w:t>Phase 1: High HP</w:t>
-      </w:r>
-    </w:p>
-    <w:p/>
-    <w:p>
-      <w:r>
-        <w:t>Phase 2: Low HP, summons minions</w:t>
-      </w:r>
-    </w:p>
-    <w:p/>
+      <w:pPr>
+        <w:pStyle w:val="Heading3"/>
+        <w:rPr>
+          <w:rStyle w:val="Heading3Char"/>
+        </w:rPr>
+      </w:pPr>
+      <w:r>
+        <w:rPr>
+          <w:rStyle w:val="Heading3Char"/>
+        </w:rPr>
+        <w:t>Final Boss</w:t>
+      </w:r>
+    </w:p>
+    <w:p>
+      <w:pPr>
+        <w:rPr>
+          <w:lang w:val="en-MT"/>
+        </w:rPr>
+      </w:pPr>
+      <w:r>
+        <w:rPr>
+          <w:b/>
+          <w:bCs/>
+          <w:lang w:val="en-MT"/>
+        </w:rPr>
+        <w:t>The Lich King</w:t>
+      </w:r>
+    </w:p>
+    <w:p>
+      <w:pPr>
+        <w:rPr>
+          <w:lang w:val="en-MT"/>
+        </w:rPr>
+      </w:pPr>
+      <w:r>
+        <w:rPr>
+          <w:b/>
+          <w:bCs/>
+          <w:lang w:val="en-MT"/>
+        </w:rPr>
+        <w:t>Lore:</w:t>
+      </w:r>
+      <w:r>
+        <w:rPr>
+          <w:lang w:val="en-MT"/>
+        </w:rPr>
+        <w:br/>
+        <w:t>Once a powerful but corrupt ruler, the king became obsessed with the forbidden knowledge of magic. In his endless search for power and immortality, he neglected his kingdom and its people. Eventually, his ambition caught the attention of the Demon King. Seeing potential in the fallen ruler, the Demon King granted him the dark knowledge of immortality.</w:t>
+      </w:r>
+    </w:p>
+    <w:p>
+      <w:pPr>
+        <w:rPr>
+          <w:lang w:val="en-MT"/>
+        </w:rPr>
+      </w:pPr>
+      <w:r>
+        <w:rPr>
+          <w:lang w:val="en-MT"/>
+        </w:rPr>
+        <w:t>Through this forbidden ritual, the king abandoned his humanity and was reborn as the Lich King—an undead servant bound to the will of the Demon King. Now he acts as the Demon King's right hand, spreading corruption and commanding the undead armies that serve the dark realm.</w:t>
+      </w:r>
+    </w:p>
+    <w:p>
+      <w:pPr>
+        <w:rPr>
+          <w:lang w:val="en-MT"/>
+        </w:rPr>
+      </w:pPr>
+    </w:p>
+    <w:p>
+      <w:pPr>
+        <w:rPr>
+          <w:lang w:val="en-MT"/>
+        </w:rPr>
+      </w:pPr>
+      <w:r>
+        <w:rPr>
+          <w:b/>
+          <w:bCs/>
+          <w:lang w:val="en-MT"/>
+        </w:rPr>
+        <w:t>Appearance:</w:t>
+      </w:r>
+      <w:r>
+        <w:rPr>
+          <w:lang w:val="en-MT"/>
+        </w:rPr>
+        <w:br/>
+        <w:t xml:space="preserve">The Lich King appears as a skeletal corpse wrapped in a red and gold robe once worn by royalty. His empty eye sockets glow faintly with dark magic. In his hand he carries a </w:t>
+      </w:r>
+      <w:proofErr w:type="spellStart"/>
+      <w:r>
+        <w:rPr>
+          <w:lang w:val="en-MT"/>
+        </w:rPr>
+        <w:t>scepter</w:t>
+      </w:r>
+      <w:proofErr w:type="spellEnd"/>
+      <w:r>
+        <w:rPr>
+          <w:lang w:val="en-MT"/>
+        </w:rPr>
+        <w:t xml:space="preserve"> crowned with a flaming, glowing eyeball that watches his enemies. Upon his head rests a royal crown decorated with </w:t>
+      </w:r>
+      <w:proofErr w:type="spellStart"/>
+      <w:r>
+        <w:rPr>
+          <w:lang w:val="en-MT"/>
+        </w:rPr>
+        <w:t>multicolored</w:t>
+      </w:r>
+      <w:proofErr w:type="spellEnd"/>
+      <w:r>
+        <w:rPr>
+          <w:lang w:val="en-MT"/>
+        </w:rPr>
+        <w:t xml:space="preserve"> gems, a reminder of the kingdom he once ruled.</w:t>
+      </w:r>
+    </w:p>
+    <w:p>
+      <w:pPr>
+        <w:rPr>
+          <w:lang w:val="en-MT"/>
+        </w:rPr>
+      </w:pPr>
+    </w:p>
+    <w:p>
+      <w:pPr>
+        <w:rPr>
+          <w:b/>
+          <w:bCs/>
+          <w:lang w:val="en-MT"/>
+        </w:rPr>
+      </w:pPr>
+      <w:r>
+        <w:rPr>
+          <w:b/>
+          <w:bCs/>
+          <w:lang w:val="en-MT"/>
+        </w:rPr>
+        <w:t>Boss Encounter:</w:t>
+      </w:r>
+    </w:p>
+    <w:p>
+      <w:pPr>
+        <w:rPr>
+          <w:b/>
+          <w:bCs/>
+          <w:lang w:val="en-MT"/>
+        </w:rPr>
+      </w:pPr>
+      <w:r>
+        <w:rPr>
+          <w:b/>
+          <w:bCs/>
+          <w:lang w:val="en-MT"/>
+        </w:rPr>
+        <w:t xml:space="preserve">As the player enters the room  it a long corridor as the player reaches the point it becomes </w:t>
+      </w:r>
+      <w:proofErr w:type="spellStart"/>
+      <w:r>
+        <w:rPr>
+          <w:b/>
+          <w:bCs/>
+          <w:lang w:val="en-MT"/>
+        </w:rPr>
+        <w:t>drak</w:t>
+      </w:r>
+      <w:proofErr w:type="spellEnd"/>
+      <w:r>
+        <w:rPr>
+          <w:b/>
+          <w:bCs/>
+          <w:lang w:val="en-MT"/>
+        </w:rPr>
+        <w:t xml:space="preserve"> all of a sudden and then a glowing(green  flame) appears and the lich king </w:t>
+      </w:r>
+      <w:proofErr w:type="spellStart"/>
+      <w:r>
+        <w:rPr>
+          <w:b/>
+          <w:bCs/>
+          <w:lang w:val="en-MT"/>
+        </w:rPr>
+        <w:t>spkeaks</w:t>
+      </w:r>
+      <w:proofErr w:type="spellEnd"/>
+      <w:r>
+        <w:rPr>
+          <w:b/>
+          <w:bCs/>
+          <w:lang w:val="en-MT"/>
+        </w:rPr>
+        <w:t xml:space="preserve"> at the end of the speech the  room decor like candles </w:t>
+      </w:r>
+      <w:proofErr w:type="spellStart"/>
+      <w:r>
+        <w:rPr>
+          <w:b/>
+          <w:bCs/>
+          <w:lang w:val="en-MT"/>
+        </w:rPr>
+        <w:t>ect</w:t>
+      </w:r>
+      <w:proofErr w:type="spellEnd"/>
+      <w:r>
+        <w:rPr>
+          <w:b/>
+          <w:bCs/>
+          <w:lang w:val="en-MT"/>
+        </w:rPr>
+        <w:t xml:space="preserve"> lights up with green flames  as the player sees the lich king  sitting on a </w:t>
+      </w:r>
+      <w:proofErr w:type="spellStart"/>
+      <w:r>
+        <w:rPr>
+          <w:b/>
+          <w:bCs/>
+          <w:lang w:val="en-MT"/>
+        </w:rPr>
+        <w:t>trhon</w:t>
+      </w:r>
+      <w:proofErr w:type="spellEnd"/>
+      <w:r>
+        <w:rPr>
+          <w:b/>
+          <w:bCs/>
+          <w:lang w:val="en-MT"/>
+        </w:rPr>
+        <w:t xml:space="preserve"> and sleeping at the foot is the skeleton of the </w:t>
+      </w:r>
+      <w:proofErr w:type="spellStart"/>
+      <w:r>
+        <w:rPr>
+          <w:b/>
+          <w:bCs/>
+          <w:lang w:val="en-MT"/>
+        </w:rPr>
+        <w:t>dragni</w:t>
+      </w:r>
+      <w:proofErr w:type="spellEnd"/>
+      <w:r>
+        <w:rPr>
+          <w:b/>
+          <w:bCs/>
+          <w:lang w:val="en-MT"/>
+        </w:rPr>
+        <w:t xml:space="preserve"> king  he commands to arise and the </w:t>
+      </w:r>
+      <w:proofErr w:type="spellStart"/>
+      <w:r>
+        <w:rPr>
+          <w:b/>
+          <w:bCs/>
+          <w:lang w:val="en-MT"/>
+        </w:rPr>
+        <w:t>skelliton</w:t>
+      </w:r>
+      <w:proofErr w:type="spellEnd"/>
+      <w:r>
+        <w:rPr>
+          <w:b/>
+          <w:bCs/>
+          <w:lang w:val="en-MT"/>
+        </w:rPr>
+        <w:t xml:space="preserve"> wakes up and roars</w:t>
+      </w:r>
+      <w:r>
+        <w:rPr>
+          <w:lang w:val="en-MT"/>
+        </w:rPr>
+        <w:br/>
+      </w:r>
+      <w:r>
+        <w:rPr>
+          <w:b/>
+          <w:bCs/>
+          <w:lang w:val="en-MT"/>
+        </w:rPr>
+        <w:t>Boss Encounter:</w:t>
+      </w:r>
+    </w:p>
+    <w:p>
+      <w:pPr>
+        <w:rPr>
+          <w:b/>
+          <w:bCs/>
+          <w:lang w:val="en-MT"/>
+        </w:rPr>
+      </w:pPr>
+      <w:r>
+        <w:rPr>
+          <w:b/>
+          <w:bCs/>
+          <w:lang w:val="en-MT"/>
+        </w:rPr>
+        <w:t xml:space="preserve">As the player enters the room, they walk through a long corridor. As they reach the </w:t>
+      </w:r>
+      <w:proofErr w:type="spellStart"/>
+      <w:r>
+        <w:rPr>
+          <w:b/>
+          <w:bCs/>
+          <w:lang w:val="en-MT"/>
+        </w:rPr>
+        <w:t>center</w:t>
+      </w:r>
+      <w:proofErr w:type="spellEnd"/>
+      <w:r>
+        <w:rPr>
+          <w:b/>
+          <w:bCs/>
+          <w:lang w:val="en-MT"/>
+        </w:rPr>
+        <w:t>, the room suddenly becomes completely dark. A small green flame slowly appears in the distance.</w:t>
+      </w:r>
+    </w:p>
+    <w:p>
+      <w:pPr>
+        <w:rPr>
+          <w:b/>
+          <w:bCs/>
+          <w:lang w:val="en-MT"/>
+        </w:rPr>
+      </w:pPr>
+      <w:r>
+        <w:rPr>
+          <w:b/>
+          <w:bCs/>
+          <w:lang w:val="en-MT"/>
+        </w:rPr>
+        <w:t>From the darkness, the Lich King begins to speak. As his speech ends, the decorations in the room—candles, braziers, and torches—ignite with eerie green flames, revealing the throne room.</w:t>
+      </w:r>
+    </w:p>
+    <w:p>
+      <w:pPr>
+        <w:rPr>
+          <w:b/>
+          <w:bCs/>
+          <w:lang w:val="en-MT"/>
+        </w:rPr>
+      </w:pPr>
+      <w:r>
+        <w:rPr>
+          <w:b/>
+          <w:bCs/>
+          <w:lang w:val="en-MT"/>
+        </w:rPr>
+        <w:lastRenderedPageBreak/>
+        <w:t>The player then sees the Lich King sitting on his throne. At the foot of the throne lies the skeletal remains of the Dragon King, resting as if it were sleeping.</w:t>
+      </w:r>
+    </w:p>
+    <w:p>
+      <w:pPr>
+        <w:rPr>
+          <w:b/>
+          <w:bCs/>
+          <w:lang w:val="en-MT"/>
+        </w:rPr>
+      </w:pPr>
+      <w:r>
+        <w:rPr>
+          <w:b/>
+          <w:bCs/>
+          <w:lang w:val="en-MT"/>
+        </w:rPr>
+        <w:t xml:space="preserve">The Lich King raises his </w:t>
+      </w:r>
+      <w:proofErr w:type="spellStart"/>
+      <w:r>
+        <w:rPr>
+          <w:b/>
+          <w:bCs/>
+          <w:lang w:val="en-MT"/>
+        </w:rPr>
+        <w:t>scepter</w:t>
+      </w:r>
+      <w:proofErr w:type="spellEnd"/>
+      <w:r>
+        <w:rPr>
+          <w:b/>
+          <w:bCs/>
+          <w:lang w:val="en-MT"/>
+        </w:rPr>
+        <w:t xml:space="preserve"> and commands the creature to arise. The skeleton begins to move, its bones rattling as dark magic fills them. The Skeletal Dragon King awakens, lifting its head before letting out a terrifying roar.</w:t>
+      </w:r>
+    </w:p>
+    <w:p>
+      <w:pPr>
+        <w:rPr>
+          <w:b/>
+          <w:bCs/>
+          <w:lang w:val="en-MT"/>
+        </w:rPr>
+      </w:pPr>
+      <w:r>
+        <w:rPr>
+          <w:b/>
+          <w:bCs/>
+          <w:lang w:val="en-MT"/>
+        </w:rPr>
+        <w:t>The battle begins.</w:t>
+      </w:r>
+    </w:p>
+    <w:p>
+      <w:pPr>
+        <w:rPr>
+          <w:b/>
+          <w:bCs/>
+          <w:lang w:val="en-MT"/>
+        </w:rPr>
+      </w:pPr>
+      <w:r>
+        <w:rPr>
+          <w:b/>
+          <w:bCs/>
+          <w:lang w:val="en-MT"/>
+        </w:rPr>
+        <w:t>Boss Encounter:</w:t>
+      </w:r>
+    </w:p>
+    <w:p>
+      <w:pPr>
+        <w:rPr>
+          <w:b/>
+          <w:bCs/>
+          <w:lang w:val="en-MT"/>
+        </w:rPr>
+      </w:pPr>
+      <w:r>
+        <w:rPr>
+          <w:b/>
+          <w:bCs/>
+          <w:lang w:val="en-MT"/>
+        </w:rPr>
+        <w:t xml:space="preserve">As the player enters the room, they walk through a long corridor. As they reach the </w:t>
+      </w:r>
+      <w:proofErr w:type="spellStart"/>
+      <w:r>
+        <w:rPr>
+          <w:b/>
+          <w:bCs/>
+          <w:lang w:val="en-MT"/>
+        </w:rPr>
+        <w:t>center</w:t>
+      </w:r>
+      <w:proofErr w:type="spellEnd"/>
+      <w:r>
+        <w:rPr>
+          <w:b/>
+          <w:bCs/>
+          <w:lang w:val="en-MT"/>
+        </w:rPr>
+        <w:t>, the room suddenly becomes completely dark. A small green flame slowly appears in the distance.</w:t>
+      </w:r>
+    </w:p>
+    <w:p>
+      <w:pPr>
+        <w:rPr>
+          <w:b/>
+          <w:bCs/>
+          <w:lang w:val="en-MT"/>
+        </w:rPr>
+      </w:pPr>
+      <w:r>
+        <w:rPr>
+          <w:b/>
+          <w:bCs/>
+          <w:lang w:val="en-MT"/>
+        </w:rPr>
+        <w:t>From the darkness, the Lich King begins to speak. As his speech ends, the decorations in the room—candles, braziers, and torches—ignite with eerie green flames, revealing the throne room.</w:t>
+      </w:r>
+    </w:p>
+    <w:p>
+      <w:pPr>
+        <w:rPr>
+          <w:b/>
+          <w:bCs/>
+          <w:lang w:val="en-MT"/>
+        </w:rPr>
+      </w:pPr>
+      <w:r>
+        <w:rPr>
+          <w:b/>
+          <w:bCs/>
+          <w:lang w:val="en-MT"/>
+        </w:rPr>
+        <w:t>The player then sees the Lich King sitting on his throne. At the foot of the throne lies the skeletal remains of the Dragon King, resting as if it were sleeping.</w:t>
+      </w:r>
+    </w:p>
+    <w:p>
+      <w:pPr>
+        <w:rPr>
+          <w:b/>
+          <w:bCs/>
+          <w:lang w:val="en-MT"/>
+        </w:rPr>
+      </w:pPr>
+      <w:r>
+        <w:rPr>
+          <w:b/>
+          <w:bCs/>
+          <w:lang w:val="en-MT"/>
+        </w:rPr>
+        <w:t xml:space="preserve">The Lich King raises his </w:t>
+      </w:r>
+      <w:proofErr w:type="spellStart"/>
+      <w:r>
+        <w:rPr>
+          <w:b/>
+          <w:bCs/>
+          <w:lang w:val="en-MT"/>
+        </w:rPr>
+        <w:t>scepter</w:t>
+      </w:r>
+      <w:proofErr w:type="spellEnd"/>
+      <w:r>
+        <w:rPr>
+          <w:b/>
+          <w:bCs/>
+          <w:lang w:val="en-MT"/>
+        </w:rPr>
+        <w:t xml:space="preserve"> and commands the creature to arise. The skeleton begins to move, its bones rattling as dark magic fills them. The Skeletal Dragon King awakens, lifting its head before letting out a terrifying roar.</w:t>
+      </w:r>
+    </w:p>
+    <w:p>
+      <w:pPr>
+        <w:rPr>
+          <w:b/>
+          <w:bCs/>
+          <w:lang w:val="en-MT"/>
+        </w:rPr>
+      </w:pPr>
+      <w:r>
+        <w:rPr>
+          <w:b/>
+          <w:bCs/>
+          <w:lang w:val="en-MT"/>
+        </w:rPr>
+        <w:t>The battle begins.</w:t>
+      </w:r>
+    </w:p>
+    <w:p>
+      <w:pPr>
+        <w:rPr>
+          <w:b/>
+          <w:bCs/>
+          <w:lang w:val="en-MT"/>
+        </w:rPr>
+      </w:pPr>
+      <w:r>
+        <w:rPr>
+          <w:b/>
+          <w:bCs/>
+          <w:lang w:val="en-MT"/>
+        </w:rPr>
+        <w:t>Boss Encounter:</w:t>
+      </w:r>
+    </w:p>
+    <w:p>
+      <w:pPr>
+        <w:rPr>
+          <w:b/>
+          <w:bCs/>
+          <w:lang w:val="en-MT"/>
+        </w:rPr>
+      </w:pPr>
+      <w:r>
+        <w:rPr>
+          <w:b/>
+          <w:bCs/>
+          <w:lang w:val="en-MT"/>
+        </w:rPr>
+        <w:t xml:space="preserve">As the player enters the room, they walk through a long corridor. As they reach the </w:t>
+      </w:r>
+      <w:proofErr w:type="spellStart"/>
+      <w:r>
+        <w:rPr>
+          <w:b/>
+          <w:bCs/>
+          <w:lang w:val="en-MT"/>
+        </w:rPr>
+        <w:t>center</w:t>
+      </w:r>
+      <w:proofErr w:type="spellEnd"/>
+      <w:r>
+        <w:rPr>
+          <w:b/>
+          <w:bCs/>
+          <w:lang w:val="en-MT"/>
+        </w:rPr>
+        <w:t>, the room suddenly becomes completely dark. A small green flame slowly appears in the distance.</w:t>
+      </w:r>
+    </w:p>
+    <w:p>
+      <w:pPr>
+        <w:rPr>
+          <w:b/>
+          <w:bCs/>
+          <w:lang w:val="en-MT"/>
+        </w:rPr>
+      </w:pPr>
+      <w:r>
+        <w:rPr>
+          <w:b/>
+          <w:bCs/>
+          <w:lang w:val="en-MT"/>
+        </w:rPr>
+        <w:t>From the darkness, the Lich King begins to speak. As his speech ends, the decorations in the room—candles, braziers, and torches—ignite with eerie green flames, revealing the throne room.</w:t>
+      </w:r>
+    </w:p>
+    <w:p>
+      <w:pPr>
+        <w:rPr>
+          <w:b/>
+          <w:bCs/>
+          <w:lang w:val="en-MT"/>
+        </w:rPr>
+      </w:pPr>
+      <w:r>
+        <w:rPr>
+          <w:b/>
+          <w:bCs/>
+          <w:lang w:val="en-MT"/>
+        </w:rPr>
+        <w:t>The player then sees the Lich King sitting on his throne. At the foot of the throne lies the skeletal remains of the Dragon King, resting as if it were sleeping.</w:t>
+      </w:r>
+    </w:p>
+    <w:p>
+      <w:pPr>
+        <w:rPr>
+          <w:b/>
+          <w:bCs/>
+          <w:lang w:val="en-MT"/>
+        </w:rPr>
+      </w:pPr>
+      <w:r>
+        <w:rPr>
+          <w:b/>
+          <w:bCs/>
+          <w:lang w:val="en-MT"/>
+        </w:rPr>
+        <w:t xml:space="preserve">The Lich King raises his </w:t>
+      </w:r>
+      <w:proofErr w:type="spellStart"/>
+      <w:r>
+        <w:rPr>
+          <w:b/>
+          <w:bCs/>
+          <w:lang w:val="en-MT"/>
+        </w:rPr>
+        <w:t>scepter</w:t>
+      </w:r>
+      <w:proofErr w:type="spellEnd"/>
+      <w:r>
+        <w:rPr>
+          <w:b/>
+          <w:bCs/>
+          <w:lang w:val="en-MT"/>
+        </w:rPr>
+        <w:t xml:space="preserve"> and commands the creature to arise. The skeleton begins to move, its bones rattling as dark magic fills them. The Skeletal Dragon King awakens, lifting its head before letting out a terrifying roar.</w:t>
+      </w:r>
+    </w:p>
+    <w:p>
+      <w:pPr>
+        <w:rPr>
+          <w:b/>
+          <w:bCs/>
+          <w:lang w:val="en-MT"/>
+        </w:rPr>
+      </w:pPr>
+      <w:r>
+        <w:rPr>
+          <w:b/>
+          <w:bCs/>
+          <w:lang w:val="en-MT"/>
+        </w:rPr>
+        <w:t>The battle begins.</w:t>
+      </w:r>
+    </w:p>
+    <w:p>
+      <w:pPr>
+        <w:rPr>
+          <w:b/>
+          <w:bCs/>
+          <w:lang w:val="en-MT"/>
+        </w:rPr>
+      </w:pPr>
+      <w:r>
+        <w:rPr>
+          <w:b/>
+          <w:bCs/>
+          <w:lang w:val="en-MT"/>
+        </w:rPr>
+        <w:t>Boss Encounter:</w:t>
+      </w:r>
+    </w:p>
+    <w:p>
+      <w:pPr>
+        <w:rPr>
+          <w:b/>
+          <w:bCs/>
+          <w:lang w:val="en-MT"/>
+        </w:rPr>
+      </w:pPr>
+      <w:r>
+        <w:rPr>
+          <w:b/>
+          <w:bCs/>
+          <w:lang w:val="en-MT"/>
+        </w:rPr>
+        <w:lastRenderedPageBreak/>
+        <w:t xml:space="preserve">As the player enters the room, they walk through a long corridor. As they reach the </w:t>
+      </w:r>
+      <w:proofErr w:type="spellStart"/>
+      <w:r>
+        <w:rPr>
+          <w:b/>
+          <w:bCs/>
+          <w:lang w:val="en-MT"/>
+        </w:rPr>
+        <w:t>center</w:t>
+      </w:r>
+      <w:proofErr w:type="spellEnd"/>
+      <w:r>
+        <w:rPr>
+          <w:b/>
+          <w:bCs/>
+          <w:lang w:val="en-MT"/>
+        </w:rPr>
+        <w:t>, the room suddenly becomes completely dark. A small green flame slowly appears in the distance.</w:t>
+      </w:r>
+    </w:p>
+    <w:p>
+      <w:pPr>
+        <w:rPr>
+          <w:b/>
+          <w:bCs/>
+          <w:lang w:val="en-MT"/>
+        </w:rPr>
+      </w:pPr>
+      <w:r>
+        <w:rPr>
+          <w:b/>
+          <w:bCs/>
+          <w:lang w:val="en-MT"/>
+        </w:rPr>
+        <w:t>From the darkness, the Lich King begins to speak. As his speech ends, the decorations in the room—candles, braziers, and torches—ignite with eerie green flames, revealing the throne room.</w:t>
+      </w:r>
+    </w:p>
+    <w:p>
+      <w:pPr>
+        <w:rPr>
+          <w:b/>
+          <w:bCs/>
+          <w:lang w:val="en-MT"/>
+        </w:rPr>
+      </w:pPr>
+      <w:r>
+        <w:rPr>
+          <w:b/>
+          <w:bCs/>
+          <w:lang w:val="en-MT"/>
+        </w:rPr>
+        <w:t>The player then sees the Lich King sitting on his throne. At the foot of the throne lies the skeletal remains of the Dragon King, resting as if it were sleeping.</w:t>
+      </w:r>
+    </w:p>
+    <w:p>
+      <w:pPr>
+        <w:rPr>
+          <w:b/>
+          <w:bCs/>
+          <w:lang w:val="en-MT"/>
+        </w:rPr>
+      </w:pPr>
+      <w:r>
+        <w:rPr>
+          <w:b/>
+          <w:bCs/>
+          <w:lang w:val="en-MT"/>
+        </w:rPr>
+        <w:t xml:space="preserve">The Lich King raises his </w:t>
+      </w:r>
+      <w:proofErr w:type="spellStart"/>
+      <w:r>
+        <w:rPr>
+          <w:b/>
+          <w:bCs/>
+          <w:lang w:val="en-MT"/>
+        </w:rPr>
+        <w:t>scepter</w:t>
+      </w:r>
+      <w:proofErr w:type="spellEnd"/>
+      <w:r>
+        <w:rPr>
+          <w:b/>
+          <w:bCs/>
+          <w:lang w:val="en-MT"/>
+        </w:rPr>
+        <w:t xml:space="preserve"> and commands the creature to arise. The skeleton begins to move, its bones rattling as dark magic fills them. The Skeletal Dragon King awakens, lifting its head before letting out a terrifying roar.</w:t>
+      </w:r>
+    </w:p>
+    <w:p>
+      <w:pPr>
+        <w:rPr>
+          <w:b/>
+          <w:bCs/>
+          <w:lang w:val="en-MT"/>
+        </w:rPr>
+      </w:pPr>
+      <w:r>
+        <w:rPr>
+          <w:b/>
+          <w:bCs/>
+          <w:lang w:val="en-MT"/>
+        </w:rPr>
+        <w:t>The battle begins.</w:t>
+      </w:r>
+    </w:p>
+    <w:p>
+      <w:pPr>
+        <w:rPr>
+          <w:b/>
+          <w:bCs/>
+          <w:lang w:val="en-MT"/>
+        </w:rPr>
+      </w:pPr>
+      <w:r>
+        <w:rPr>
+          <w:b/>
+          <w:bCs/>
+          <w:lang w:val="en-MT"/>
+        </w:rPr>
+        <w:t>Boss Encounter:</w:t>
+      </w:r>
+    </w:p>
+    <w:p>
+      <w:pPr>
+        <w:rPr>
+          <w:b/>
+          <w:bCs/>
+          <w:lang w:val="en-MT"/>
+        </w:rPr>
+      </w:pPr>
+      <w:r>
+        <w:rPr>
+          <w:b/>
+          <w:bCs/>
+          <w:lang w:val="en-MT"/>
+        </w:rPr>
+        <w:t xml:space="preserve">As the player enters the room, they walk through a long corridor. As they reach the </w:t>
+      </w:r>
+      <w:proofErr w:type="spellStart"/>
+      <w:r>
+        <w:rPr>
+          <w:b/>
+          <w:bCs/>
+          <w:lang w:val="en-MT"/>
+        </w:rPr>
+        <w:t>center</w:t>
+      </w:r>
+      <w:proofErr w:type="spellEnd"/>
+      <w:r>
+        <w:rPr>
+          <w:b/>
+          <w:bCs/>
+          <w:lang w:val="en-MT"/>
+        </w:rPr>
+        <w:t>, the room suddenly becomes completely dark. A small green flame slowly appears in the distance.</w:t>
+      </w:r>
+    </w:p>
+    <w:p>
+      <w:pPr>
+        <w:rPr>
+          <w:b/>
+          <w:bCs/>
+          <w:lang w:val="en-MT"/>
+        </w:rPr>
+      </w:pPr>
+      <w:r>
+        <w:rPr>
+          <w:b/>
+          <w:bCs/>
+          <w:lang w:val="en-MT"/>
+        </w:rPr>
+        <w:t>From the darkness, the Lich King begins to speak. As his speech ends, the decorations in the room—candles, braziers, and torches—ignite with eerie green flames, revealing the throne room.</w:t>
+      </w:r>
+    </w:p>
+    <w:p>
+      <w:pPr>
+        <w:rPr>
+          <w:b/>
+          <w:bCs/>
+          <w:lang w:val="en-MT"/>
+        </w:rPr>
+      </w:pPr>
+      <w:r>
+        <w:rPr>
+          <w:b/>
+          <w:bCs/>
+          <w:lang w:val="en-MT"/>
+        </w:rPr>
+        <w:t>The player then sees the Lich King sitting on his throne. At the foot of the throne lies the skeletal remains of the Dragon King, resting as if it were sleeping.</w:t>
+      </w:r>
+    </w:p>
+    <w:p>
+      <w:pPr>
+        <w:rPr>
+          <w:b/>
+          <w:bCs/>
+          <w:lang w:val="en-MT"/>
+        </w:rPr>
+      </w:pPr>
+      <w:r>
+        <w:rPr>
+          <w:b/>
+          <w:bCs/>
+          <w:lang w:val="en-MT"/>
+        </w:rPr>
+        <w:t xml:space="preserve">The Lich King raises his </w:t>
+      </w:r>
+      <w:proofErr w:type="spellStart"/>
+      <w:r>
+        <w:rPr>
+          <w:b/>
+          <w:bCs/>
+          <w:lang w:val="en-MT"/>
+        </w:rPr>
+        <w:t>scepter</w:t>
+      </w:r>
+      <w:proofErr w:type="spellEnd"/>
+      <w:r>
+        <w:rPr>
+          <w:b/>
+          <w:bCs/>
+          <w:lang w:val="en-MT"/>
+        </w:rPr>
+        <w:t xml:space="preserve"> and commands the creature to arise. The skeleton begins to move, its bones rattling as dark magic fills them. The Skeletal Dragon King awakens, lifting its head before letting out a terrifying roar.</w:t>
+      </w:r>
+    </w:p>
+    <w:p>
+      <w:pPr>
+        <w:rPr>
+          <w:b/>
+          <w:bCs/>
+          <w:lang w:val="en-MT"/>
+        </w:rPr>
+      </w:pPr>
+      <w:r>
+        <w:rPr>
+          <w:b/>
+          <w:bCs/>
+          <w:lang w:val="en-MT"/>
+        </w:rPr>
+        <w:t>The battle begins.</w:t>
+      </w:r>
+    </w:p>
+    <w:p>
+      <w:pPr>
+        <w:rPr>
+          <w:b/>
+          <w:bCs/>
+          <w:lang w:val="en-MT"/>
+        </w:rPr>
+      </w:pPr>
+      <w:r>
+        <w:rPr>
+          <w:b/>
+          <w:bCs/>
+          <w:lang w:val="en-MT"/>
+        </w:rPr>
+        <w:t>Boss Encounter:</w:t>
+      </w:r>
+    </w:p>
+    <w:p>
+      <w:pPr>
+        <w:rPr>
+          <w:b/>
+          <w:bCs/>
+          <w:lang w:val="en-MT"/>
+        </w:rPr>
+      </w:pPr>
+      <w:r>
+        <w:rPr>
+          <w:b/>
+          <w:bCs/>
+          <w:lang w:val="en-MT"/>
+        </w:rPr>
+        <w:t xml:space="preserve">As the player enters the room, they walk through a long corridor. As they reach the </w:t>
+      </w:r>
+      <w:proofErr w:type="spellStart"/>
+      <w:r>
+        <w:rPr>
+          <w:b/>
+          <w:bCs/>
+          <w:lang w:val="en-MT"/>
+        </w:rPr>
+        <w:t>center</w:t>
+      </w:r>
+      <w:proofErr w:type="spellEnd"/>
+      <w:r>
+        <w:rPr>
+          <w:b/>
+          <w:bCs/>
+          <w:lang w:val="en-MT"/>
+        </w:rPr>
+        <w:t>, the room suddenly becomes completely dark. A small green flame slowly appears in the distance.</w:t>
+      </w:r>
+    </w:p>
+    <w:p>
+      <w:pPr>
+        <w:rPr>
+          <w:b/>
+          <w:bCs/>
+          <w:lang w:val="en-MT"/>
+        </w:rPr>
+      </w:pPr>
+      <w:r>
+        <w:rPr>
+          <w:b/>
+          <w:bCs/>
+          <w:lang w:val="en-MT"/>
+        </w:rPr>
+        <w:t>From the darkness, the Lich King begins to speak. As his speech ends, the decorations in the room—candles, braziers, and torches—ignite with eerie green flames, revealing the throne room.</w:t>
+      </w:r>
+    </w:p>
+    <w:p>
+      <w:pPr>
+        <w:rPr>
+          <w:b/>
+          <w:bCs/>
+          <w:lang w:val="en-MT"/>
+        </w:rPr>
+      </w:pPr>
+      <w:r>
+        <w:rPr>
+          <w:b/>
+          <w:bCs/>
+          <w:lang w:val="en-MT"/>
+        </w:rPr>
+        <w:t>The player then sees the Lich King sitting on his throne. At the foot of the throne lies the skeletal remains of the Dragon King, resting as if it were sleeping.</w:t>
+      </w:r>
+    </w:p>
+    <w:p>
+      <w:pPr>
+        <w:rPr>
+          <w:b/>
+          <w:bCs/>
+          <w:lang w:val="en-MT"/>
+        </w:rPr>
+      </w:pPr>
+      <w:r>
+        <w:rPr>
+          <w:b/>
+          <w:bCs/>
+          <w:lang w:val="en-MT"/>
+        </w:rPr>
+        <w:lastRenderedPageBreak/>
+        <w:t xml:space="preserve">The Lich King raises his </w:t>
+      </w:r>
+      <w:proofErr w:type="spellStart"/>
+      <w:r>
+        <w:rPr>
+          <w:b/>
+          <w:bCs/>
+          <w:lang w:val="en-MT"/>
+        </w:rPr>
+        <w:t>scepter</w:t>
+      </w:r>
+      <w:proofErr w:type="spellEnd"/>
+      <w:r>
+        <w:rPr>
+          <w:b/>
+          <w:bCs/>
+          <w:lang w:val="en-MT"/>
+        </w:rPr>
+        <w:t xml:space="preserve"> and commands the creature to arise. The skeleton begins to move, its bones rattling as dark magic fills them. The Skeletal Dragon King awakens, lifting its head before letting out a terrifying roar.</w:t>
+      </w:r>
+    </w:p>
+    <w:p>
+      <w:pPr>
+        <w:rPr>
+          <w:b/>
+          <w:bCs/>
+          <w:lang w:val="en-MT"/>
+        </w:rPr>
+      </w:pPr>
+      <w:r>
+        <w:rPr>
+          <w:b/>
+          <w:bCs/>
+          <w:lang w:val="en-MT"/>
+        </w:rPr>
+        <w:t>The battle begins.</w:t>
+      </w:r>
+    </w:p>
+    <w:p>
+      <w:pPr>
+        <w:rPr>
+          <w:b/>
+          <w:bCs/>
+          <w:lang w:val="en-MT"/>
+        </w:rPr>
+      </w:pPr>
+      <w:r>
+        <w:rPr>
+          <w:b/>
+          <w:bCs/>
+          <w:lang w:val="en-MT"/>
+        </w:rPr>
+        <w:t>Boss Encounter:</w:t>
+      </w:r>
+    </w:p>
+    <w:p>
+      <w:pPr>
+        <w:rPr>
+          <w:b/>
+          <w:bCs/>
+          <w:lang w:val="en-MT"/>
+        </w:rPr>
+      </w:pPr>
+      <w:r>
+        <w:rPr>
+          <w:b/>
+          <w:bCs/>
+          <w:lang w:val="en-MT"/>
+        </w:rPr>
+        <w:t xml:space="preserve">As the player enters the room, they walk through a long corridor. As they reach the </w:t>
+      </w:r>
+      <w:proofErr w:type="spellStart"/>
+      <w:r>
+        <w:rPr>
+          <w:b/>
+          <w:bCs/>
+          <w:lang w:val="en-MT"/>
+        </w:rPr>
+        <w:t>center</w:t>
+      </w:r>
+      <w:proofErr w:type="spellEnd"/>
+      <w:r>
+        <w:rPr>
+          <w:b/>
+          <w:bCs/>
+          <w:lang w:val="en-MT"/>
+        </w:rPr>
+        <w:t>, the room suddenly becomes completely dark. A small green flame slowly appears in the distance.</w:t>
+      </w:r>
+    </w:p>
+    <w:p>
+      <w:pPr>
+        <w:rPr>
+          <w:b/>
+          <w:bCs/>
+          <w:lang w:val="en-MT"/>
+        </w:rPr>
+      </w:pPr>
+      <w:r>
+        <w:rPr>
+          <w:b/>
+          <w:bCs/>
+          <w:lang w:val="en-MT"/>
+        </w:rPr>
+        <w:t>From the darkness, the Lich King begins to speak. As his speech ends, the decorations in the room—candles, braziers, and torches—ignite with eerie green flames, revealing the throne room.</w:t>
+      </w:r>
+    </w:p>
+    <w:p>
+      <w:pPr>
+        <w:rPr>
+          <w:b/>
+          <w:bCs/>
+          <w:lang w:val="en-MT"/>
+        </w:rPr>
+      </w:pPr>
+      <w:r>
+        <w:rPr>
+          <w:b/>
+          <w:bCs/>
+          <w:lang w:val="en-MT"/>
+        </w:rPr>
+        <w:t>The player then sees the Lich King sitting on his throne. At the foot of the throne lies the skeletal remains of the Dragon King, resting as if it were sleeping.</w:t>
+      </w:r>
+    </w:p>
+    <w:p>
+      <w:pPr>
+        <w:rPr>
+          <w:b/>
+          <w:bCs/>
+          <w:lang w:val="en-MT"/>
+        </w:rPr>
+      </w:pPr>
+      <w:r>
+        <w:rPr>
+          <w:b/>
+          <w:bCs/>
+          <w:lang w:val="en-MT"/>
+        </w:rPr>
+        <w:t xml:space="preserve">The Lich King raises his </w:t>
+      </w:r>
+      <w:proofErr w:type="spellStart"/>
+      <w:r>
+        <w:rPr>
+          <w:b/>
+          <w:bCs/>
+          <w:lang w:val="en-MT"/>
+        </w:rPr>
+        <w:t>scepter</w:t>
+      </w:r>
+      <w:proofErr w:type="spellEnd"/>
+      <w:r>
+        <w:rPr>
+          <w:b/>
+          <w:bCs/>
+          <w:lang w:val="en-MT"/>
+        </w:rPr>
+        <w:t xml:space="preserve"> and commands the creature to arise. The skeleton begins to move, its bones rattling as dark magic fills them. The Skeletal Dragon King awakens, lifting its head before letting out a terrifying roar.</w:t>
+      </w:r>
+    </w:p>
+    <w:p>
+      <w:pPr>
+        <w:rPr>
+          <w:b/>
+          <w:bCs/>
+          <w:lang w:val="en-MT"/>
+        </w:rPr>
+      </w:pPr>
+      <w:r>
+        <w:rPr>
+          <w:b/>
+          <w:bCs/>
+          <w:lang w:val="en-MT"/>
+        </w:rPr>
+        <w:t>The battle begins.</w:t>
+      </w:r>
+    </w:p>
+    <w:p>
+      <w:pPr>
+        <w:rPr>
+          <w:b/>
+          <w:bCs/>
+          <w:lang w:val="en-MT"/>
+        </w:rPr>
+      </w:pPr>
+      <w:r>
+        <w:rPr>
+          <w:b/>
+          <w:bCs/>
+          <w:lang w:val="en-MT"/>
+        </w:rPr>
+        <w:t>Boss Encounter:</w:t>
+      </w:r>
+    </w:p>
+    <w:p>
+      <w:pPr>
+        <w:rPr>
+          <w:b/>
+          <w:bCs/>
+          <w:lang w:val="en-MT"/>
+        </w:rPr>
+      </w:pPr>
+      <w:r>
+        <w:rPr>
+          <w:b/>
+          <w:bCs/>
+          <w:lang w:val="en-MT"/>
+        </w:rPr>
+        <w:t xml:space="preserve">As the player enters the room, they walk through a long corridor. As they reach the </w:t>
+      </w:r>
+      <w:proofErr w:type="spellStart"/>
+      <w:r>
+        <w:rPr>
+          <w:b/>
+          <w:bCs/>
+          <w:lang w:val="en-MT"/>
+        </w:rPr>
+        <w:t>center</w:t>
+      </w:r>
+      <w:proofErr w:type="spellEnd"/>
+      <w:r>
+        <w:rPr>
+          <w:b/>
+          <w:bCs/>
+          <w:lang w:val="en-MT"/>
+        </w:rPr>
+        <w:t>, the room suddenly becomes completely dark. A small green flame slowly appears in the distance.</w:t>
+      </w:r>
+    </w:p>
+    <w:p>
+      <w:pPr>
+        <w:rPr>
+          <w:b/>
+          <w:bCs/>
+          <w:lang w:val="en-MT"/>
+        </w:rPr>
+      </w:pPr>
+      <w:r>
+        <w:rPr>
+          <w:b/>
+          <w:bCs/>
+          <w:lang w:val="en-MT"/>
+        </w:rPr>
+        <w:t>From the darkness, the Lich King begins to speak. As his speech ends, the decorations in the room—candles, braziers, and torches—ignite with eerie green flames, revealing the throne room.</w:t>
+      </w:r>
+    </w:p>
+    <w:p>
+      <w:pPr>
+        <w:rPr>
+          <w:b/>
+          <w:bCs/>
+          <w:lang w:val="en-MT"/>
+        </w:rPr>
+      </w:pPr>
+      <w:r>
+        <w:rPr>
+          <w:b/>
+          <w:bCs/>
+          <w:lang w:val="en-MT"/>
+        </w:rPr>
+        <w:t>The player then sees the Lich King sitting on his throne. At the foot of the throne lies the skeletal remains of the Dragon King, resting as if it were sleeping.</w:t>
+      </w:r>
+    </w:p>
+    <w:p>
+      <w:pPr>
+        <w:rPr>
+          <w:b/>
+          <w:bCs/>
+          <w:lang w:val="en-MT"/>
+        </w:rPr>
+      </w:pPr>
+      <w:r>
+        <w:rPr>
+          <w:b/>
+          <w:bCs/>
+          <w:lang w:val="en-MT"/>
+        </w:rPr>
+        <w:t xml:space="preserve">The Lich King raises his </w:t>
+      </w:r>
+      <w:proofErr w:type="spellStart"/>
+      <w:r>
+        <w:rPr>
+          <w:b/>
+          <w:bCs/>
+          <w:lang w:val="en-MT"/>
+        </w:rPr>
+        <w:t>scepter</w:t>
+      </w:r>
+      <w:proofErr w:type="spellEnd"/>
+      <w:r>
+        <w:rPr>
+          <w:b/>
+          <w:bCs/>
+          <w:lang w:val="en-MT"/>
+        </w:rPr>
+        <w:t xml:space="preserve"> and commands the creature to arise. The skeleton begins to move, its bones rattling as dark magic fills them. The Skeletal Dragon King awakens, lifting its head before letting out a terrifying roar.</w:t>
+      </w:r>
+    </w:p>
+    <w:p>
+      <w:pPr>
+        <w:rPr>
+          <w:b/>
+          <w:bCs/>
+          <w:lang w:val="en-MT"/>
+        </w:rPr>
+      </w:pPr>
+      <w:r>
+        <w:rPr>
+          <w:b/>
+          <w:bCs/>
+          <w:lang w:val="en-MT"/>
+        </w:rPr>
+        <w:t>The battle begins.</w:t>
+      </w:r>
+    </w:p>
+    <w:p>
+      <w:pPr>
+        <w:rPr>
+          <w:lang w:val="en-MT"/>
+        </w:rPr>
+      </w:pPr>
+    </w:p>
+    <w:p>
+      <w:pPr>
+        <w:rPr>
+          <w:lang w:val="en-MT"/>
+        </w:rPr>
+      </w:pPr>
+      <w:r>
+        <w:rPr>
+          <w:lang w:val="en-MT"/>
+        </w:rPr>
+        <w:t>Phase 1</w:t>
+      </w:r>
+    </w:p>
+    <w:p>
+      <w:pPr>
+        <w:rPr>
+          <w:lang w:val="en-MT"/>
+        </w:rPr>
+      </w:pPr>
+    </w:p>
+    <w:p>
+      <w:pPr>
+        <w:rPr>
+          <w:lang w:val="en-MT"/>
+        </w:rPr>
+      </w:pPr>
+      <w:r>
+        <w:rPr>
+          <w:lang w:val="en-MT"/>
+        </w:rPr>
+        <w:lastRenderedPageBreak/>
+        <w:t>Boss has high hp</w:t>
+      </w:r>
+    </w:p>
+    <w:p>
+      <w:pPr>
+        <w:rPr>
+          <w:lang w:val="en-MT"/>
+        </w:rPr>
+      </w:pPr>
+      <w:r>
+        <w:rPr>
+          <w:lang w:val="en-MT"/>
+        </w:rPr>
+        <w:t xml:space="preserve">The lich king is on the </w:t>
+      </w:r>
+      <w:proofErr w:type="spellStart"/>
+      <w:r>
+        <w:rPr>
+          <w:lang w:val="en-MT"/>
+        </w:rPr>
+        <w:t>thron</w:t>
+      </w:r>
+      <w:proofErr w:type="spellEnd"/>
+      <w:r>
+        <w:rPr>
+          <w:lang w:val="en-MT"/>
+        </w:rPr>
+        <w:t xml:space="preserve"> and casts a </w:t>
+      </w:r>
+      <w:proofErr w:type="spellStart"/>
+      <w:r>
+        <w:rPr>
+          <w:lang w:val="en-MT"/>
+        </w:rPr>
+        <w:t>mgic</w:t>
+      </w:r>
+      <w:proofErr w:type="spellEnd"/>
+      <w:r>
+        <w:rPr>
+          <w:lang w:val="en-MT"/>
+        </w:rPr>
+        <w:t xml:space="preserve"> </w:t>
+      </w:r>
+      <w:proofErr w:type="spellStart"/>
+      <w:r>
+        <w:rPr>
+          <w:lang w:val="en-MT"/>
+        </w:rPr>
+        <w:t>shile</w:t>
+      </w:r>
+      <w:proofErr w:type="spellEnd"/>
+      <w:r>
+        <w:rPr>
+          <w:lang w:val="en-MT"/>
+        </w:rPr>
+        <w:t xml:space="preserve"> that protects him </w:t>
+      </w:r>
+    </w:p>
+    <w:p>
+      <w:pPr>
+        <w:rPr>
+          <w:lang w:val="en-MT"/>
+        </w:rPr>
+      </w:pPr>
+      <w:r>
+        <w:rPr>
+          <w:lang w:val="en-MT"/>
+        </w:rPr>
+        <w:t xml:space="preserve">When lich kings cast spell to attack the </w:t>
+      </w:r>
+      <w:proofErr w:type="gramStart"/>
+      <w:r>
+        <w:rPr>
+          <w:lang w:val="en-MT"/>
+        </w:rPr>
+        <w:t>player</w:t>
+      </w:r>
+      <w:proofErr w:type="gramEnd"/>
+      <w:r>
+        <w:rPr>
+          <w:lang w:val="en-MT"/>
+        </w:rPr>
+        <w:t xml:space="preserve"> he drops the </w:t>
+      </w:r>
+      <w:proofErr w:type="spellStart"/>
+      <w:r>
+        <w:rPr>
+          <w:lang w:val="en-MT"/>
+        </w:rPr>
+        <w:t>sheald</w:t>
+      </w:r>
+      <w:proofErr w:type="spellEnd"/>
+      <w:r>
+        <w:rPr>
+          <w:lang w:val="en-MT"/>
+        </w:rPr>
+        <w:t xml:space="preserve"> then they can attack him</w:t>
+      </w:r>
+    </w:p>
+    <w:p>
+      <w:pPr>
+        <w:rPr>
+          <w:lang w:val="en-MT"/>
+        </w:rPr>
+      </w:pPr>
+    </w:p>
+    <w:p>
+      <w:pPr>
+        <w:rPr>
+          <w:lang w:val="en-MT"/>
+        </w:rPr>
+      </w:pPr>
+    </w:p>
+    <w:p>
+      <w:pPr>
+        <w:rPr>
+          <w:lang w:val="en-MT"/>
+        </w:rPr>
+      </w:pPr>
+      <w:r>
+        <w:rPr>
+          <w:lang w:val="en-MT"/>
+        </w:rPr>
+        <w:t>attacks</w:t>
+      </w:r>
+    </w:p>
+    <w:p>
+      <w:proofErr w:type="spellStart"/>
+      <w:r>
+        <w:t>licht</w:t>
+      </w:r>
+      <w:proofErr w:type="spellEnd"/>
+      <w:r>
+        <w:t xml:space="preserve"> king: </w:t>
+      </w:r>
+    </w:p>
+    <w:p>
+      <w:pPr>
+        <w:pStyle w:val="ListParagraph"/>
+        <w:numPr>
+          <w:ilvl w:val="1"/>
+          <w:numId w:val="16"/>
+        </w:numPr>
+      </w:pPr>
+      <w:r>
+        <w:t>shoots eldritch blasts 5 times</w:t>
+      </w:r>
+    </w:p>
+    <w:p>
+      <w:pPr>
+        <w:pStyle w:val="ListParagraph"/>
+        <w:numPr>
+          <w:ilvl w:val="1"/>
+          <w:numId w:val="16"/>
+        </w:numPr>
+      </w:pPr>
+      <w:r>
+        <w:t xml:space="preserve">charges a beam </w:t>
+      </w:r>
+      <w:proofErr w:type="spellStart"/>
+      <w:r>
+        <w:t>attak</w:t>
+      </w:r>
+      <w:proofErr w:type="spellEnd"/>
+      <w:r>
+        <w:t xml:space="preserve"> that once cats he takes longer to activate shield</w:t>
+      </w:r>
+    </w:p>
+    <w:p>
+      <w:pPr>
+        <w:pStyle w:val="ListParagraph"/>
+        <w:numPr>
+          <w:ilvl w:val="1"/>
+          <w:numId w:val="16"/>
+        </w:numPr>
+      </w:pPr>
+      <w:r>
+        <w:t>summons small fire eyeballs that home on the player</w:t>
+      </w:r>
+    </w:p>
+    <w:p>
+      <w:r>
+        <w:t xml:space="preserve">dragon </w:t>
+      </w:r>
+      <w:proofErr w:type="gramStart"/>
+      <w:r>
+        <w:t>king :</w:t>
+      </w:r>
+      <w:proofErr w:type="gramEnd"/>
+    </w:p>
+    <w:p>
+      <w:pPr>
+        <w:pStyle w:val="ListParagraph"/>
+        <w:numPr>
+          <w:ilvl w:val="0"/>
+          <w:numId w:val="41"/>
+        </w:numPr>
+      </w:pPr>
+      <w:r>
+        <w:t xml:space="preserve">flies above the player and </w:t>
+      </w:r>
+      <w:proofErr w:type="gramStart"/>
+      <w:r>
+        <w:t>dose  a</w:t>
+      </w:r>
+      <w:proofErr w:type="gramEnd"/>
+      <w:r>
+        <w:t xml:space="preserve"> breath </w:t>
+      </w:r>
+      <w:proofErr w:type="spellStart"/>
+      <w:r>
+        <w:t>attak</w:t>
+      </w:r>
+      <w:proofErr w:type="spellEnd"/>
+    </w:p>
+    <w:p>
+      <w:pPr>
+        <w:pStyle w:val="ListParagraph"/>
+        <w:ind w:left="1506"/>
+      </w:pPr>
+    </w:p>
+    <w:p>
+      <w:pPr>
+        <w:pStyle w:val="ListParagraph"/>
+        <w:ind w:left="1506"/>
+      </w:pPr>
+    </w:p>
+    <w:p>
+      <w:pPr>
+        <w:pStyle w:val="ListParagraph"/>
+        <w:ind w:left="1506"/>
+      </w:pPr>
+    </w:p>
     <w:p>
       <w:r>
         <w:t>Arena: Lich’s Castle</w:t>
       </w:r>
     </w:p>
+    <w:p>
+      <w:r>
+        <w:t>Phase2</w:t>
+      </w:r>
+    </w:p>
+    <w:p>
+      <w:r>
+        <w:t xml:space="preserve">Weaker hp amount </w:t>
+      </w:r>
+    </w:p>
+    <w:p>
+      <w:r>
+        <w:t>Phase transition:</w:t>
+      </w:r>
+    </w:p>
+    <w:p>
+      <w:pPr>
+        <w:rPr>
+          <w:lang w:val="en-MT"/>
+        </w:rPr>
+      </w:pPr>
+      <w:r>
+        <w:rPr>
+          <w:lang w:val="en-MT"/>
+        </w:rPr>
+        <w:t xml:space="preserve">After taking enough damage, the Lich King loses concentration while controlling the </w:t>
+      </w:r>
+      <w:r>
+        <w:rPr>
+          <w:b/>
+          <w:bCs/>
+          <w:lang w:val="en-MT"/>
+        </w:rPr>
+        <w:t>Skeletal Dragon</w:t>
+      </w:r>
+      <w:r>
+        <w:rPr>
+          <w:lang w:val="en-MT"/>
+        </w:rPr>
+        <w:t xml:space="preserve">. Because of this, the Skeletal Dragon suddenly </w:t>
+      </w:r>
+      <w:r>
+        <w:rPr>
+          <w:b/>
+          <w:bCs/>
+          <w:lang w:val="en-MT"/>
+        </w:rPr>
+        <w:t>explodes into pieces</w:t>
+      </w:r>
+      <w:r>
+        <w:rPr>
+          <w:lang w:val="en-MT"/>
+        </w:rPr>
+        <w:t>, and its bones scatter across the floor.</w:t>
+      </w:r>
+    </w:p>
+    <w:p>
+      <w:pPr>
+        <w:rPr>
+          <w:lang w:val="en-MT"/>
+        </w:rPr>
+      </w:pPr>
+      <w:r>
+        <w:rPr>
+          <w:lang w:val="en-MT"/>
+        </w:rPr>
+        <w:t xml:space="preserve">After a moment, the bones begin to move and slide across the ground, </w:t>
+      </w:r>
+      <w:r>
+        <w:rPr>
+          <w:b/>
+          <w:bCs/>
+          <w:lang w:val="en-MT"/>
+        </w:rPr>
+        <w:t>locking themselves into the floor</w:t>
+      </w:r>
+      <w:r>
+        <w:rPr>
+          <w:lang w:val="en-MT"/>
+        </w:rPr>
+        <w:t xml:space="preserve">. They form large </w:t>
+      </w:r>
+      <w:r>
+        <w:rPr>
+          <w:b/>
+          <w:bCs/>
+          <w:lang w:val="en-MT"/>
+        </w:rPr>
+        <w:t>bone plates</w:t>
+      </w:r>
+      <w:r>
+        <w:rPr>
+          <w:lang w:val="en-MT"/>
+        </w:rPr>
+        <w:t xml:space="preserve"> that the player can use during the next phase of the battle.</w:t>
+      </w:r>
+    </w:p>
+    <w:p>
+      <w:pPr>
+        <w:rPr>
+          <w:lang w:val="en-MT"/>
+        </w:rPr>
+      </w:pPr>
+      <w:r>
+        <w:rPr>
+          <w:lang w:val="en-MT"/>
+        </w:rPr>
+        <w:t xml:space="preserve">After the explosion, the Lich King speaks, </w:t>
+      </w:r>
+      <w:r>
+        <w:rPr>
+          <w:b/>
+          <w:bCs/>
+          <w:lang w:val="en-MT"/>
+        </w:rPr>
+        <w:t>cursing the player for making him lose focus on his spell</w:t>
+      </w:r>
+      <w:r>
+        <w:rPr>
+          <w:lang w:val="en-MT"/>
+        </w:rPr>
+        <w:t xml:space="preserve">. He tells the player that they will pay for this with their life and become </w:t>
+      </w:r>
+      <w:r>
+        <w:rPr>
+          <w:b/>
+          <w:bCs/>
+          <w:lang w:val="en-MT"/>
+        </w:rPr>
+        <w:t>an eternal slave</w:t>
+      </w:r>
+      <w:r>
+        <w:rPr>
+          <w:lang w:val="en-MT"/>
+        </w:rPr>
+        <w:t>, just like the other heroes who once tried to defeat him.</w:t>
+      </w:r>
+    </w:p>
+    <w:p>
+      <w:pPr>
+        <w:rPr>
+          <w:lang w:val="en-MT"/>
+        </w:rPr>
+      </w:pPr>
+      <w:r>
+        <w:rPr>
+          <w:lang w:val="en-MT"/>
+        </w:rPr>
+        <w:t xml:space="preserve">Suddenly, the lights in the room go out. A </w:t>
+      </w:r>
+      <w:r>
+        <w:rPr>
+          <w:b/>
+          <w:bCs/>
+          <w:lang w:val="en-MT"/>
+        </w:rPr>
+        <w:t>teleportation sound effect</w:t>
+      </w:r>
+      <w:r>
+        <w:rPr>
+          <w:lang w:val="en-MT"/>
+        </w:rPr>
+        <w:t xml:space="preserve"> echoes through the chamber as the </w:t>
+      </w:r>
+      <w:r>
+        <w:rPr>
+          <w:b/>
+          <w:bCs/>
+          <w:lang w:val="en-MT"/>
+        </w:rPr>
+        <w:t xml:space="preserve">Lich King teleports to the </w:t>
+      </w:r>
+      <w:proofErr w:type="spellStart"/>
+      <w:r>
+        <w:rPr>
+          <w:b/>
+          <w:bCs/>
+          <w:lang w:val="en-MT"/>
+        </w:rPr>
+        <w:t>center</w:t>
+      </w:r>
+      <w:proofErr w:type="spellEnd"/>
+      <w:r>
+        <w:rPr>
+          <w:b/>
+          <w:bCs/>
+          <w:lang w:val="en-MT"/>
+        </w:rPr>
+        <w:t xml:space="preserve"> of the room</w:t>
+      </w:r>
+      <w:r>
+        <w:rPr>
+          <w:lang w:val="en-MT"/>
+        </w:rPr>
+        <w:t xml:space="preserve">. A </w:t>
+      </w:r>
+      <w:r>
+        <w:rPr>
+          <w:b/>
+          <w:bCs/>
+          <w:lang w:val="en-MT"/>
+        </w:rPr>
+        <w:t>giant flaming eyeball appears in the air</w:t>
+      </w:r>
+      <w:r>
+        <w:rPr>
+          <w:lang w:val="en-MT"/>
+        </w:rPr>
+        <w:t>, preparing to attack.</w:t>
+      </w:r>
+    </w:p>
+    <w:p>
+      <w:proofErr w:type="spellStart"/>
+      <w:r>
+        <w:lastRenderedPageBreak/>
+        <w:t>licht</w:t>
+      </w:r>
+      <w:proofErr w:type="spellEnd"/>
+      <w:r>
+        <w:t xml:space="preserve"> king: </w:t>
+      </w:r>
+    </w:p>
+    <w:p>
+      <w:pPr>
+        <w:pStyle w:val="ListParagraph"/>
+        <w:numPr>
+          <w:ilvl w:val="1"/>
+          <w:numId w:val="42"/>
+        </w:numPr>
+      </w:pPr>
+      <w:r>
+        <w:t xml:space="preserve">summons </w:t>
+      </w:r>
+      <w:proofErr w:type="spellStart"/>
+      <w:r>
+        <w:t>skelitons</w:t>
+      </w:r>
+      <w:proofErr w:type="spellEnd"/>
+      <w:r>
+        <w:t xml:space="preserve"> to </w:t>
+      </w:r>
+      <w:proofErr w:type="spellStart"/>
+      <w:r>
+        <w:t>attak</w:t>
+      </w:r>
+      <w:proofErr w:type="spellEnd"/>
+      <w:r>
+        <w:t xml:space="preserve"> the player </w:t>
+      </w:r>
+    </w:p>
+    <w:p>
+      <w:pPr>
+        <w:pStyle w:val="ListParagraph"/>
+        <w:numPr>
+          <w:ilvl w:val="1"/>
+          <w:numId w:val="42"/>
+        </w:numPr>
+      </w:pPr>
+      <w:r>
+        <w:t xml:space="preserve">Summons for a second a skeleton version of the </w:t>
+      </w:r>
+      <w:proofErr w:type="gramStart"/>
+      <w:r>
+        <w:t>plyer  using</w:t>
+      </w:r>
+      <w:proofErr w:type="gramEnd"/>
+      <w:r>
+        <w:t xml:space="preserve"> an ability of one of the many classes</w:t>
+      </w:r>
+    </w:p>
+    <w:p>
+      <w:pPr>
+        <w:pStyle w:val="ListParagraph"/>
+        <w:numPr>
+          <w:ilvl w:val="1"/>
+          <w:numId w:val="42"/>
+        </w:numPr>
+      </w:pPr>
+      <w:r>
+        <w:t xml:space="preserve">Summons 2 flaming eyes that shoot </w:t>
+      </w:r>
+      <w:proofErr w:type="spellStart"/>
+      <w:proofErr w:type="gramStart"/>
+      <w:r>
+        <w:t>quik</w:t>
+      </w:r>
+      <w:proofErr w:type="spellEnd"/>
+      <w:r>
+        <w:t xml:space="preserve">  beams</w:t>
+      </w:r>
+      <w:proofErr w:type="gramEnd"/>
+      <w:r>
+        <w:t xml:space="preserve"> of flames</w:t>
+      </w:r>
+    </w:p>
+    <w:p>
+      <w:pPr>
+        <w:pStyle w:val="ListParagraph"/>
+        <w:numPr>
+          <w:ilvl w:val="1"/>
+          <w:numId w:val="42"/>
+        </w:numPr>
+      </w:pPr>
+    </w:p>
+    <w:p>
+      <w:r>
+        <w:t xml:space="preserve"> </w:t>
+      </w:r>
+    </w:p>
+    <w:p/>
     <w:p/>
     <w:p>
       <w:r>
@@ -4426,17 +6352,17 @@
         <w:pStyle w:val="Heading4"/>
       </w:pPr>
       <w:r>
+        <w:t>Attacks</w:t>
+      </w:r>
+    </w:p>
+    <w:p/>
+    <w:p/>
+    <w:p>
+      <w:pPr>
+        <w:pStyle w:val="Heading3"/>
+      </w:pPr>
+      <w:r>
         <w:lastRenderedPageBreak/>
-        <w:t>Attacks</w:t>
-      </w:r>
-    </w:p>
-    <w:p/>
-    <w:p/>
-    <w:p>
-      <w:pPr>
-        <w:pStyle w:val="Heading3"/>
-      </w:pPr>
-      <w:r>
         <w:t>Final Boss</w:t>
       </w:r>
     </w:p>
@@ -5736,6 +7662,95 @@
     </w:lvl>
   </w:abstractNum>
   <w:abstractNum w:abstractNumId="7" w15:restartNumberingAfterBreak="0">
+    <w:nsid w:val="20482100"/>
+    <w:multiLevelType w:val="hybridMultilevel"/>
+    <w:tmpl w:val="8668CDA4"/>
+    <w:lvl w:ilvl="0" w:tplc="20000011">
+      <w:start w:val="1"/>
+      <w:numFmt w:val="decimal"/>
+      <w:lvlText w:val="%1)"/>
+      <w:lvlJc w:val="left"/>
+      <w:pPr>
+        <w:ind w:left="720" w:hanging="360"/>
+      </w:pPr>
+      <w:rPr>
+        <w:rFonts w:hint="default"/>
+      </w:rPr>
+    </w:lvl>
+    <w:lvl w:ilvl="1" w:tplc="20000019" w:tentative="1">
+      <w:start w:val="1"/>
+      <w:numFmt w:val="lowerLetter"/>
+      <w:lvlText w:val="%2."/>
+      <w:lvlJc w:val="left"/>
+      <w:pPr>
+        <w:ind w:left="1440" w:hanging="360"/>
+      </w:pPr>
+    </w:lvl>
+    <w:lvl w:ilvl="2" w:tplc="2000001B" w:tentative="1">
+      <w:start w:val="1"/>
+      <w:numFmt w:val="lowerRoman"/>
+      <w:lvlText w:val="%3."/>
+      <w:lvlJc w:val="right"/>
+      <w:pPr>
+        <w:ind w:left="2160" w:hanging="180"/>
+      </w:pPr>
+    </w:lvl>
+    <w:lvl w:ilvl="3" w:tplc="2000000F" w:tentative="1">
+      <w:start w:val="1"/>
+      <w:numFmt w:val="decimal"/>
+      <w:lvlText w:val="%4."/>
+      <w:lvlJc w:val="left"/>
+      <w:pPr>
+        <w:ind w:left="2880" w:hanging="360"/>
+      </w:pPr>
+    </w:lvl>
+    <w:lvl w:ilvl="4" w:tplc="20000019" w:tentative="1">
+      <w:start w:val="1"/>
+      <w:numFmt w:val="lowerLetter"/>
+      <w:lvlText w:val="%5."/>
+      <w:lvlJc w:val="left"/>
+      <w:pPr>
+        <w:ind w:left="3600" w:hanging="360"/>
+      </w:pPr>
+    </w:lvl>
+    <w:lvl w:ilvl="5" w:tplc="2000001B" w:tentative="1">
+      <w:start w:val="1"/>
+      <w:numFmt w:val="lowerRoman"/>
+      <w:lvlText w:val="%6."/>
+      <w:lvlJc w:val="right"/>
+      <w:pPr>
+        <w:ind w:left="4320" w:hanging="180"/>
+      </w:pPr>
+    </w:lvl>
+    <w:lvl w:ilvl="6" w:tplc="2000000F" w:tentative="1">
+      <w:start w:val="1"/>
+      <w:numFmt w:val="decimal"/>
+      <w:lvlText w:val="%7."/>
+      <w:lvlJc w:val="left"/>
+      <w:pPr>
+        <w:ind w:left="5040" w:hanging="360"/>
+      </w:pPr>
+    </w:lvl>
+    <w:lvl w:ilvl="7" w:tplc="20000019" w:tentative="1">
+      <w:start w:val="1"/>
+      <w:numFmt w:val="lowerLetter"/>
+      <w:lvlText w:val="%8."/>
+      <w:lvlJc w:val="left"/>
+      <w:pPr>
+        <w:ind w:left="5760" w:hanging="360"/>
+      </w:pPr>
+    </w:lvl>
+    <w:lvl w:ilvl="8" w:tplc="2000001B" w:tentative="1">
+      <w:start w:val="1"/>
+      <w:numFmt w:val="lowerRoman"/>
+      <w:lvlText w:val="%9."/>
+      <w:lvlJc w:val="right"/>
+      <w:pPr>
+        <w:ind w:left="6480" w:hanging="180"/>
+      </w:pPr>
+    </w:lvl>
+  </w:abstractNum>
+  <w:abstractNum w:abstractNumId="8" w15:restartNumberingAfterBreak="0">
     <w:nsid w:val="22722BBB"/>
     <w:multiLevelType w:val="multilevel"/>
     <w:tmpl w:val="BAEEF5C4"/>
@@ -5848,7 +7863,7 @@
       </w:pPr>
     </w:lvl>
   </w:abstractNum>
-  <w:abstractNum w:abstractNumId="8" w15:restartNumberingAfterBreak="0">
+  <w:abstractNum w:abstractNumId="9" w15:restartNumberingAfterBreak="0">
     <w:nsid w:val="23216659"/>
     <w:multiLevelType w:val="multilevel"/>
     <w:tmpl w:val="6A768F1C"/>
@@ -5961,7 +7976,7 @@
       </w:pPr>
     </w:lvl>
   </w:abstractNum>
-  <w:abstractNum w:abstractNumId="9" w15:restartNumberingAfterBreak="0">
+  <w:abstractNum w:abstractNumId="10" w15:restartNumberingAfterBreak="0">
     <w:nsid w:val="23996D11"/>
     <w:multiLevelType w:val="multilevel"/>
     <w:tmpl w:val="09706898"/>
@@ -6074,7 +8089,7 @@
       </w:pPr>
     </w:lvl>
   </w:abstractNum>
-  <w:abstractNum w:abstractNumId="10" w15:restartNumberingAfterBreak="0">
+  <w:abstractNum w:abstractNumId="11" w15:restartNumberingAfterBreak="0">
     <w:nsid w:val="282E1AE4"/>
     <w:multiLevelType w:val="multilevel"/>
     <w:tmpl w:val="BF941CA6"/>
@@ -6187,7 +8202,7 @@
       </w:pPr>
     </w:lvl>
   </w:abstractNum>
-  <w:abstractNum w:abstractNumId="11" w15:restartNumberingAfterBreak="0">
+  <w:abstractNum w:abstractNumId="12" w15:restartNumberingAfterBreak="0">
     <w:nsid w:val="28464CBB"/>
     <w:multiLevelType w:val="hybridMultilevel"/>
     <w:tmpl w:val="C3CAC86C"/>
@@ -6276,7 +8291,7 @@
       </w:pPr>
     </w:lvl>
   </w:abstractNum>
-  <w:abstractNum w:abstractNumId="12" w15:restartNumberingAfterBreak="0">
+  <w:abstractNum w:abstractNumId="13" w15:restartNumberingAfterBreak="0">
     <w:nsid w:val="2B7140FE"/>
     <w:multiLevelType w:val="multilevel"/>
     <w:tmpl w:val="0EF29C36"/>
@@ -6389,7 +8404,121 @@
       </w:pPr>
     </w:lvl>
   </w:abstractNum>
-  <w:abstractNum w:abstractNumId="13" w15:restartNumberingAfterBreak="0">
+  <w:abstractNum w:abstractNumId="14" w15:restartNumberingAfterBreak="0">
+    <w:nsid w:val="2CDD60EB"/>
+    <w:multiLevelType w:val="multilevel"/>
+    <w:tmpl w:val="0B4CC5BC"/>
+    <w:lvl w:ilvl="0">
+      <w:start w:val="1"/>
+      <w:numFmt w:val="decimal"/>
+      <w:lvlText w:val="%1."/>
+      <w:lvlJc w:val="left"/>
+      <w:pPr>
+        <w:tabs>
+          <w:tab w:val="num" w:pos="720"/>
+        </w:tabs>
+        <w:ind w:left="720" w:hanging="360"/>
+      </w:pPr>
+    </w:lvl>
+    <w:lvl w:ilvl="1">
+      <w:start w:val="1"/>
+      <w:numFmt w:val="decimal"/>
+      <w:lvlText w:val="%2)"/>
+      <w:lvlJc w:val="left"/>
+      <w:pPr>
+        <w:ind w:left="1440" w:hanging="360"/>
+      </w:pPr>
+      <w:rPr>
+        <w:rFonts w:hint="default"/>
+        <w:b w:val="0"/>
+      </w:rPr>
+    </w:lvl>
+    <w:lvl w:ilvl="2" w:tentative="1">
+      <w:start w:val="1"/>
+      <w:numFmt w:val="decimal"/>
+      <w:lvlText w:val="%3."/>
+      <w:lvlJc w:val="left"/>
+      <w:pPr>
+        <w:tabs>
+          <w:tab w:val="num" w:pos="2160"/>
+        </w:tabs>
+        <w:ind w:left="2160" w:hanging="360"/>
+      </w:pPr>
+    </w:lvl>
+    <w:lvl w:ilvl="3" w:tentative="1">
+      <w:start w:val="1"/>
+      <w:numFmt w:val="decimal"/>
+      <w:lvlText w:val="%4."/>
+      <w:lvlJc w:val="left"/>
+      <w:pPr>
+        <w:tabs>
+          <w:tab w:val="num" w:pos="2880"/>
+        </w:tabs>
+        <w:ind w:left="2880" w:hanging="360"/>
+      </w:pPr>
+    </w:lvl>
+    <w:lvl w:ilvl="4" w:tentative="1">
+      <w:start w:val="1"/>
+      <w:numFmt w:val="decimal"/>
+      <w:lvlText w:val="%5."/>
+      <w:lvlJc w:val="left"/>
+      <w:pPr>
+        <w:tabs>
+          <w:tab w:val="num" w:pos="3600"/>
+        </w:tabs>
+        <w:ind w:left="3600" w:hanging="360"/>
+      </w:pPr>
+    </w:lvl>
+    <w:lvl w:ilvl="5" w:tentative="1">
+      <w:start w:val="1"/>
+      <w:numFmt w:val="decimal"/>
+      <w:lvlText w:val="%6."/>
+      <w:lvlJc w:val="left"/>
+      <w:pPr>
+        <w:tabs>
+          <w:tab w:val="num" w:pos="4320"/>
+        </w:tabs>
+        <w:ind w:left="4320" w:hanging="360"/>
+      </w:pPr>
+    </w:lvl>
+    <w:lvl w:ilvl="6" w:tentative="1">
+      <w:start w:val="1"/>
+      <w:numFmt w:val="decimal"/>
+      <w:lvlText w:val="%7."/>
+      <w:lvlJc w:val="left"/>
+      <w:pPr>
+        <w:tabs>
+          <w:tab w:val="num" w:pos="5040"/>
+        </w:tabs>
+        <w:ind w:left="5040" w:hanging="360"/>
+      </w:pPr>
+    </w:lvl>
+    <w:lvl w:ilvl="7" w:tentative="1">
+      <w:start w:val="1"/>
+      <w:numFmt w:val="decimal"/>
+      <w:lvlText w:val="%8."/>
+      <w:lvlJc w:val="left"/>
+      <w:pPr>
+        <w:tabs>
+          <w:tab w:val="num" w:pos="5760"/>
+        </w:tabs>
+        <w:ind w:left="5760" w:hanging="360"/>
+      </w:pPr>
+    </w:lvl>
+    <w:lvl w:ilvl="8" w:tentative="1">
+      <w:start w:val="1"/>
+      <w:numFmt w:val="decimal"/>
+      <w:lvlText w:val="%9."/>
+      <w:lvlJc w:val="left"/>
+      <w:pPr>
+        <w:tabs>
+          <w:tab w:val="num" w:pos="6480"/>
+        </w:tabs>
+        <w:ind w:left="6480" w:hanging="360"/>
+      </w:pPr>
+    </w:lvl>
+  </w:abstractNum>
+  <w:abstractNum w:abstractNumId="15" w15:restartNumberingAfterBreak="0">
     <w:nsid w:val="2F2F5958"/>
     <w:multiLevelType w:val="multilevel"/>
     <w:tmpl w:val="7EB6776E"/>
@@ -6502,7 +8631,7 @@
       </w:pPr>
     </w:lvl>
   </w:abstractNum>
-  <w:abstractNum w:abstractNumId="14" w15:restartNumberingAfterBreak="0">
+  <w:abstractNum w:abstractNumId="16" w15:restartNumberingAfterBreak="0">
     <w:nsid w:val="326A3A4C"/>
     <w:multiLevelType w:val="hybridMultilevel"/>
     <w:tmpl w:val="D44ABE2E"/>
@@ -6591,7 +8720,7 @@
       </w:pPr>
     </w:lvl>
   </w:abstractNum>
-  <w:abstractNum w:abstractNumId="15" w15:restartNumberingAfterBreak="0">
+  <w:abstractNum w:abstractNumId="17" w15:restartNumberingAfterBreak="0">
     <w:nsid w:val="36755A48"/>
     <w:multiLevelType w:val="multilevel"/>
     <w:tmpl w:val="ABC05D70"/>
@@ -6704,7 +8833,7 @@
       </w:pPr>
     </w:lvl>
   </w:abstractNum>
-  <w:abstractNum w:abstractNumId="16" w15:restartNumberingAfterBreak="0">
+  <w:abstractNum w:abstractNumId="18" w15:restartNumberingAfterBreak="0">
     <w:nsid w:val="3BA73747"/>
     <w:multiLevelType w:val="hybridMultilevel"/>
     <w:tmpl w:val="8346A700"/>
@@ -6793,7 +8922,7 @@
       </w:pPr>
     </w:lvl>
   </w:abstractNum>
-  <w:abstractNum w:abstractNumId="17" w15:restartNumberingAfterBreak="0">
+  <w:abstractNum w:abstractNumId="19" w15:restartNumberingAfterBreak="0">
     <w:nsid w:val="421554DA"/>
     <w:multiLevelType w:val="hybridMultilevel"/>
     <w:tmpl w:val="935CA49E"/>
@@ -6882,7 +9011,7 @@
       </w:pPr>
     </w:lvl>
   </w:abstractNum>
-  <w:abstractNum w:abstractNumId="18" w15:restartNumberingAfterBreak="0">
+  <w:abstractNum w:abstractNumId="20" w15:restartNumberingAfterBreak="0">
     <w:nsid w:val="43B069B2"/>
     <w:multiLevelType w:val="multilevel"/>
     <w:tmpl w:val="472232BA"/>
@@ -6995,7 +9124,7 @@
       </w:pPr>
     </w:lvl>
   </w:abstractNum>
-  <w:abstractNum w:abstractNumId="19" w15:restartNumberingAfterBreak="0">
+  <w:abstractNum w:abstractNumId="21" w15:restartNumberingAfterBreak="0">
     <w:nsid w:val="45324514"/>
     <w:multiLevelType w:val="hybridMultilevel"/>
     <w:tmpl w:val="584489CE"/>
@@ -7084,7 +9213,7 @@
       </w:pPr>
     </w:lvl>
   </w:abstractNum>
-  <w:abstractNum w:abstractNumId="20" w15:restartNumberingAfterBreak="0">
+  <w:abstractNum w:abstractNumId="22" w15:restartNumberingAfterBreak="0">
     <w:nsid w:val="4FDA2789"/>
     <w:multiLevelType w:val="hybridMultilevel"/>
     <w:tmpl w:val="466271B8"/>
@@ -7173,7 +9302,7 @@
       </w:pPr>
     </w:lvl>
   </w:abstractNum>
-  <w:abstractNum w:abstractNumId="21" w15:restartNumberingAfterBreak="0">
+  <w:abstractNum w:abstractNumId="23" w15:restartNumberingAfterBreak="0">
     <w:nsid w:val="50FC2BB2"/>
     <w:multiLevelType w:val="hybridMultilevel"/>
     <w:tmpl w:val="514EAB20"/>
@@ -7262,7 +9391,7 @@
       </w:pPr>
     </w:lvl>
   </w:abstractNum>
-  <w:abstractNum w:abstractNumId="22" w15:restartNumberingAfterBreak="0">
+  <w:abstractNum w:abstractNumId="24" w15:restartNumberingAfterBreak="0">
     <w:nsid w:val="52F42575"/>
     <w:multiLevelType w:val="multilevel"/>
     <w:tmpl w:val="4B349FE4"/>
@@ -7375,7 +9504,7 @@
       </w:pPr>
     </w:lvl>
   </w:abstractNum>
-  <w:abstractNum w:abstractNumId="23" w15:restartNumberingAfterBreak="0">
+  <w:abstractNum w:abstractNumId="25" w15:restartNumberingAfterBreak="0">
     <w:nsid w:val="53652074"/>
     <w:multiLevelType w:val="multilevel"/>
     <w:tmpl w:val="576E91B8"/>
@@ -7488,7 +9617,7 @@
       </w:pPr>
     </w:lvl>
   </w:abstractNum>
-  <w:abstractNum w:abstractNumId="24" w15:restartNumberingAfterBreak="0">
+  <w:abstractNum w:abstractNumId="26" w15:restartNumberingAfterBreak="0">
     <w:nsid w:val="55915528"/>
     <w:multiLevelType w:val="hybridMultilevel"/>
     <w:tmpl w:val="C994CCC6"/>
@@ -7577,7 +9706,7 @@
       </w:pPr>
     </w:lvl>
   </w:abstractNum>
-  <w:abstractNum w:abstractNumId="25" w15:restartNumberingAfterBreak="0">
+  <w:abstractNum w:abstractNumId="27" w15:restartNumberingAfterBreak="0">
     <w:nsid w:val="57A92F0D"/>
     <w:multiLevelType w:val="multilevel"/>
     <w:tmpl w:val="9030F5D0"/>
@@ -7690,7 +9819,7 @@
       </w:pPr>
     </w:lvl>
   </w:abstractNum>
-  <w:abstractNum w:abstractNumId="26" w15:restartNumberingAfterBreak="0">
+  <w:abstractNum w:abstractNumId="28" w15:restartNumberingAfterBreak="0">
     <w:nsid w:val="5B616F52"/>
     <w:multiLevelType w:val="multilevel"/>
     <w:tmpl w:val="C082B080"/>
@@ -7839,7 +9968,7 @@
       </w:rPr>
     </w:lvl>
   </w:abstractNum>
-  <w:abstractNum w:abstractNumId="27" w15:restartNumberingAfterBreak="0">
+  <w:abstractNum w:abstractNumId="29" w15:restartNumberingAfterBreak="0">
     <w:nsid w:val="5CCC5211"/>
     <w:multiLevelType w:val="hybridMultilevel"/>
     <w:tmpl w:val="14A20978"/>
@@ -7928,7 +10057,7 @@
       </w:pPr>
     </w:lvl>
   </w:abstractNum>
-  <w:abstractNum w:abstractNumId="28" w15:restartNumberingAfterBreak="0">
+  <w:abstractNum w:abstractNumId="30" w15:restartNumberingAfterBreak="0">
     <w:nsid w:val="5D0845B2"/>
     <w:multiLevelType w:val="hybridMultilevel"/>
     <w:tmpl w:val="8D86FABA"/>
@@ -8017,7 +10146,7 @@
       </w:pPr>
     </w:lvl>
   </w:abstractNum>
-  <w:abstractNum w:abstractNumId="29" w15:restartNumberingAfterBreak="0">
+  <w:abstractNum w:abstractNumId="31" w15:restartNumberingAfterBreak="0">
     <w:nsid w:val="5F8C54CC"/>
     <w:multiLevelType w:val="multilevel"/>
     <w:tmpl w:val="AD38EBC8"/>
@@ -8130,7 +10259,7 @@
       </w:pPr>
     </w:lvl>
   </w:abstractNum>
-  <w:abstractNum w:abstractNumId="30" w15:restartNumberingAfterBreak="0">
+  <w:abstractNum w:abstractNumId="32" w15:restartNumberingAfterBreak="0">
     <w:nsid w:val="60BB4216"/>
     <w:multiLevelType w:val="hybridMultilevel"/>
     <w:tmpl w:val="425424D0"/>
@@ -8219,7 +10348,7 @@
       </w:pPr>
     </w:lvl>
   </w:abstractNum>
-  <w:abstractNum w:abstractNumId="31" w15:restartNumberingAfterBreak="0">
+  <w:abstractNum w:abstractNumId="33" w15:restartNumberingAfterBreak="0">
     <w:nsid w:val="63382F85"/>
     <w:multiLevelType w:val="hybridMultilevel"/>
     <w:tmpl w:val="4498F780"/>
@@ -8309,7 +10438,7 @@
       </w:pPr>
     </w:lvl>
   </w:abstractNum>
-  <w:abstractNum w:abstractNumId="32" w15:restartNumberingAfterBreak="0">
+  <w:abstractNum w:abstractNumId="34" w15:restartNumberingAfterBreak="0">
     <w:nsid w:val="64945838"/>
     <w:multiLevelType w:val="hybridMultilevel"/>
     <w:tmpl w:val="92AAF534"/>
@@ -8398,7 +10527,7 @@
       </w:pPr>
     </w:lvl>
   </w:abstractNum>
-  <w:abstractNum w:abstractNumId="33" w15:restartNumberingAfterBreak="0">
+  <w:abstractNum w:abstractNumId="35" w15:restartNumberingAfterBreak="0">
     <w:nsid w:val="65537FDB"/>
     <w:multiLevelType w:val="multilevel"/>
     <w:tmpl w:val="895E8168"/>
@@ -8511,7 +10640,7 @@
       </w:pPr>
     </w:lvl>
   </w:abstractNum>
-  <w:abstractNum w:abstractNumId="34" w15:restartNumberingAfterBreak="0">
+  <w:abstractNum w:abstractNumId="36" w15:restartNumberingAfterBreak="0">
     <w:nsid w:val="6F2E1998"/>
     <w:multiLevelType w:val="hybridMultilevel"/>
     <w:tmpl w:val="584489CE"/>
@@ -8600,7 +10729,7 @@
       </w:pPr>
     </w:lvl>
   </w:abstractNum>
-  <w:abstractNum w:abstractNumId="35" w15:restartNumberingAfterBreak="0">
+  <w:abstractNum w:abstractNumId="37" w15:restartNumberingAfterBreak="0">
     <w:nsid w:val="6FAA098B"/>
     <w:multiLevelType w:val="hybridMultilevel"/>
     <w:tmpl w:val="584489CE"/>
@@ -8689,7 +10818,7 @@
       </w:pPr>
     </w:lvl>
   </w:abstractNum>
-  <w:abstractNum w:abstractNumId="36" w15:restartNumberingAfterBreak="0">
+  <w:abstractNum w:abstractNumId="38" w15:restartNumberingAfterBreak="0">
     <w:nsid w:val="713C5232"/>
     <w:multiLevelType w:val="hybridMultilevel"/>
     <w:tmpl w:val="56E29F16"/>
@@ -8778,7 +10907,7 @@
       </w:pPr>
     </w:lvl>
   </w:abstractNum>
-  <w:abstractNum w:abstractNumId="37" w15:restartNumberingAfterBreak="0">
+  <w:abstractNum w:abstractNumId="39" w15:restartNumberingAfterBreak="0">
     <w:nsid w:val="716746F7"/>
     <w:multiLevelType w:val="hybridMultilevel"/>
     <w:tmpl w:val="9B14C0E6"/>
@@ -8868,7 +10997,96 @@
       </w:pPr>
     </w:lvl>
   </w:abstractNum>
-  <w:abstractNum w:abstractNumId="38" w15:restartNumberingAfterBreak="0">
+  <w:abstractNum w:abstractNumId="40" w15:restartNumberingAfterBreak="0">
+    <w:nsid w:val="75521296"/>
+    <w:multiLevelType w:val="hybridMultilevel"/>
+    <w:tmpl w:val="529ED23C"/>
+    <w:lvl w:ilvl="0" w:tplc="6F80F7B4">
+      <w:start w:val="1"/>
+      <w:numFmt w:val="decimal"/>
+      <w:lvlText w:val="%1)"/>
+      <w:lvlJc w:val="left"/>
+      <w:pPr>
+        <w:ind w:left="1506" w:hanging="360"/>
+      </w:pPr>
+      <w:rPr>
+        <w:rFonts w:hint="default"/>
+      </w:rPr>
+    </w:lvl>
+    <w:lvl w:ilvl="1" w:tplc="20000019" w:tentative="1">
+      <w:start w:val="1"/>
+      <w:numFmt w:val="lowerLetter"/>
+      <w:lvlText w:val="%2."/>
+      <w:lvlJc w:val="left"/>
+      <w:pPr>
+        <w:ind w:left="2226" w:hanging="360"/>
+      </w:pPr>
+    </w:lvl>
+    <w:lvl w:ilvl="2" w:tplc="2000001B" w:tentative="1">
+      <w:start w:val="1"/>
+      <w:numFmt w:val="lowerRoman"/>
+      <w:lvlText w:val="%3."/>
+      <w:lvlJc w:val="right"/>
+      <w:pPr>
+        <w:ind w:left="2946" w:hanging="180"/>
+      </w:pPr>
+    </w:lvl>
+    <w:lvl w:ilvl="3" w:tplc="2000000F" w:tentative="1">
+      <w:start w:val="1"/>
+      <w:numFmt w:val="decimal"/>
+      <w:lvlText w:val="%4."/>
+      <w:lvlJc w:val="left"/>
+      <w:pPr>
+        <w:ind w:left="3666" w:hanging="360"/>
+      </w:pPr>
+    </w:lvl>
+    <w:lvl w:ilvl="4" w:tplc="20000019" w:tentative="1">
+      <w:start w:val="1"/>
+      <w:numFmt w:val="lowerLetter"/>
+      <w:lvlText w:val="%5."/>
+      <w:lvlJc w:val="left"/>
+      <w:pPr>
+        <w:ind w:left="4386" w:hanging="360"/>
+      </w:pPr>
+    </w:lvl>
+    <w:lvl w:ilvl="5" w:tplc="2000001B" w:tentative="1">
+      <w:start w:val="1"/>
+      <w:numFmt w:val="lowerRoman"/>
+      <w:lvlText w:val="%6."/>
+      <w:lvlJc w:val="right"/>
+      <w:pPr>
+        <w:ind w:left="5106" w:hanging="180"/>
+      </w:pPr>
+    </w:lvl>
+    <w:lvl w:ilvl="6" w:tplc="2000000F" w:tentative="1">
+      <w:start w:val="1"/>
+      <w:numFmt w:val="decimal"/>
+      <w:lvlText w:val="%7."/>
+      <w:lvlJc w:val="left"/>
+      <w:pPr>
+        <w:ind w:left="5826" w:hanging="360"/>
+      </w:pPr>
+    </w:lvl>
+    <w:lvl w:ilvl="7" w:tplc="20000019" w:tentative="1">
+      <w:start w:val="1"/>
+      <w:numFmt w:val="lowerLetter"/>
+      <w:lvlText w:val="%8."/>
+      <w:lvlJc w:val="left"/>
+      <w:pPr>
+        <w:ind w:left="6546" w:hanging="360"/>
+      </w:pPr>
+    </w:lvl>
+    <w:lvl w:ilvl="8" w:tplc="2000001B" w:tentative="1">
+      <w:start w:val="1"/>
+      <w:numFmt w:val="lowerRoman"/>
+      <w:lvlText w:val="%9."/>
+      <w:lvlJc w:val="right"/>
+      <w:pPr>
+        <w:ind w:left="7266" w:hanging="180"/>
+      </w:pPr>
+    </w:lvl>
+  </w:abstractNum>
+  <w:abstractNum w:abstractNumId="41" w15:restartNumberingAfterBreak="0">
     <w:nsid w:val="7B4D0522"/>
     <w:multiLevelType w:val="hybridMultilevel"/>
     <w:tmpl w:val="A07067FE"/>
@@ -8958,49 +11176,49 @@
     </w:lvl>
   </w:abstractNum>
   <w:num w:numId="1" w16cid:durableId="208735963">
-    <w:abstractNumId w:val="19"/>
+    <w:abstractNumId w:val="21"/>
   </w:num>
   <w:num w:numId="2" w16cid:durableId="1872916749">
-    <w:abstractNumId w:val="11"/>
+    <w:abstractNumId w:val="12"/>
   </w:num>
   <w:num w:numId="3" w16cid:durableId="1239830397">
-    <w:abstractNumId w:val="35"/>
+    <w:abstractNumId w:val="37"/>
   </w:num>
   <w:num w:numId="4" w16cid:durableId="492382466">
-    <w:abstractNumId w:val="24"/>
+    <w:abstractNumId w:val="26"/>
   </w:num>
   <w:num w:numId="5" w16cid:durableId="1851216769">
-    <w:abstractNumId w:val="28"/>
+    <w:abstractNumId w:val="30"/>
   </w:num>
   <w:num w:numId="6" w16cid:durableId="1645045013">
-    <w:abstractNumId w:val="21"/>
+    <w:abstractNumId w:val="23"/>
   </w:num>
   <w:num w:numId="7" w16cid:durableId="1254784543">
+    <w:abstractNumId w:val="41"/>
+  </w:num>
+  <w:num w:numId="8" w16cid:durableId="1715814852">
     <w:abstractNumId w:val="38"/>
   </w:num>
-  <w:num w:numId="8" w16cid:durableId="1715814852">
+  <w:num w:numId="9" w16cid:durableId="1002270431">
+    <w:abstractNumId w:val="18"/>
+  </w:num>
+  <w:num w:numId="10" w16cid:durableId="130557018">
     <w:abstractNumId w:val="36"/>
   </w:num>
-  <w:num w:numId="9" w16cid:durableId="1002270431">
-    <w:abstractNumId w:val="16"/>
-  </w:num>
-  <w:num w:numId="10" w16cid:durableId="130557018">
-    <w:abstractNumId w:val="34"/>
-  </w:num>
   <w:num w:numId="11" w16cid:durableId="1579050708">
-    <w:abstractNumId w:val="20"/>
+    <w:abstractNumId w:val="22"/>
   </w:num>
   <w:num w:numId="12" w16cid:durableId="456993558">
     <w:abstractNumId w:val="4"/>
   </w:num>
   <w:num w:numId="13" w16cid:durableId="874806022">
-    <w:abstractNumId w:val="12"/>
+    <w:abstractNumId w:val="13"/>
   </w:num>
   <w:num w:numId="14" w16cid:durableId="1078550599">
-    <w:abstractNumId w:val="17"/>
+    <w:abstractNumId w:val="19"/>
   </w:num>
   <w:num w:numId="15" w16cid:durableId="1682660559">
-    <w:abstractNumId w:val="37"/>
+    <w:abstractNumId w:val="39"/>
   </w:num>
   <w:num w:numId="16" w16cid:durableId="120660560">
     <w:abstractNumId w:val="2"/>
@@ -9012,58 +11230,58 @@
     <w:abstractNumId w:val="6"/>
   </w:num>
   <w:num w:numId="19" w16cid:durableId="297347017">
-    <w:abstractNumId w:val="27"/>
+    <w:abstractNumId w:val="29"/>
   </w:num>
   <w:num w:numId="20" w16cid:durableId="477724548">
+    <w:abstractNumId w:val="34"/>
+  </w:num>
+  <w:num w:numId="21" w16cid:durableId="155801054">
+    <w:abstractNumId w:val="16"/>
+  </w:num>
+  <w:num w:numId="22" w16cid:durableId="474760820">
     <w:abstractNumId w:val="32"/>
   </w:num>
-  <w:num w:numId="21" w16cid:durableId="155801054">
-    <w:abstractNumId w:val="14"/>
-  </w:num>
-  <w:num w:numId="22" w16cid:durableId="474760820">
-    <w:abstractNumId w:val="30"/>
-  </w:num>
   <w:num w:numId="23" w16cid:durableId="754205003">
-    <w:abstractNumId w:val="31"/>
+    <w:abstractNumId w:val="33"/>
   </w:num>
   <w:num w:numId="24" w16cid:durableId="2032805180">
-    <w:abstractNumId w:val="7"/>
+    <w:abstractNumId w:val="8"/>
   </w:num>
   <w:num w:numId="25" w16cid:durableId="2140604537">
-    <w:abstractNumId w:val="15"/>
+    <w:abstractNumId w:val="17"/>
   </w:num>
   <w:num w:numId="26" w16cid:durableId="148595364">
-    <w:abstractNumId w:val="33"/>
+    <w:abstractNumId w:val="35"/>
   </w:num>
   <w:num w:numId="27" w16cid:durableId="1320618478">
     <w:abstractNumId w:val="0"/>
   </w:num>
   <w:num w:numId="28" w16cid:durableId="1852799378">
+    <w:abstractNumId w:val="27"/>
+  </w:num>
+  <w:num w:numId="29" w16cid:durableId="759105323">
+    <w:abstractNumId w:val="11"/>
+  </w:num>
+  <w:num w:numId="30" w16cid:durableId="231359022">
+    <w:abstractNumId w:val="15"/>
+  </w:num>
+  <w:num w:numId="31" w16cid:durableId="1563246968">
+    <w:abstractNumId w:val="9"/>
+  </w:num>
+  <w:num w:numId="32" w16cid:durableId="851382581">
+    <w:abstractNumId w:val="20"/>
+  </w:num>
+  <w:num w:numId="33" w16cid:durableId="1596089347">
     <w:abstractNumId w:val="25"/>
   </w:num>
-  <w:num w:numId="29" w16cid:durableId="759105323">
+  <w:num w:numId="34" w16cid:durableId="192769589">
+    <w:abstractNumId w:val="31"/>
+  </w:num>
+  <w:num w:numId="35" w16cid:durableId="28146208">
     <w:abstractNumId w:val="10"/>
   </w:num>
-  <w:num w:numId="30" w16cid:durableId="231359022">
-    <w:abstractNumId w:val="13"/>
-  </w:num>
-  <w:num w:numId="31" w16cid:durableId="1563246968">
-    <w:abstractNumId w:val="8"/>
-  </w:num>
-  <w:num w:numId="32" w16cid:durableId="851382581">
-    <w:abstractNumId w:val="18"/>
-  </w:num>
-  <w:num w:numId="33" w16cid:durableId="1596089347">
-    <w:abstractNumId w:val="23"/>
-  </w:num>
-  <w:num w:numId="34" w16cid:durableId="192769589">
-    <w:abstractNumId w:val="29"/>
-  </w:num>
-  <w:num w:numId="35" w16cid:durableId="28146208">
-    <w:abstractNumId w:val="9"/>
-  </w:num>
   <w:num w:numId="36" w16cid:durableId="1081365102">
-    <w:abstractNumId w:val="22"/>
+    <w:abstractNumId w:val="24"/>
   </w:num>
   <w:num w:numId="37" w16cid:durableId="1754163713">
     <w:abstractNumId w:val="3"/>
@@ -9072,7 +11290,16 @@
     <w:abstractNumId w:val="1"/>
   </w:num>
   <w:num w:numId="39" w16cid:durableId="1542739640">
-    <w:abstractNumId w:val="26"/>
+    <w:abstractNumId w:val="28"/>
+  </w:num>
+  <w:num w:numId="40" w16cid:durableId="856507304">
+    <w:abstractNumId w:val="7"/>
+  </w:num>
+  <w:num w:numId="41" w16cid:durableId="1238201940">
+    <w:abstractNumId w:val="40"/>
+  </w:num>
+  <w:num w:numId="42" w16cid:durableId="1565411653">
+    <w:abstractNumId w:val="14"/>
   </w:num>
 </w:numbering>
 </file>
@@ -9477,7 +11704,7 @@
   <w:style w:type="paragraph" w:default="1" w:styleId="Normal">
     <w:name w:val="Normal"/>
     <w:qFormat/>
-    <w:rsid w:val="007C025E"/>
+    <w:rsid w:val="00B22BFE"/>
   </w:style>
   <w:style w:type="paragraph" w:styleId="Heading1">
     <w:name w:val="heading 1"/>
@@ -9678,7 +11905,6 @@
   <w:style w:type="character" w:default="1" w:styleId="DefaultParagraphFont">
     <w:name w:val="Default Paragraph Font"/>
     <w:uiPriority w:val="1"/>
-    <w:semiHidden/>
     <w:unhideWhenUsed/>
   </w:style>
   <w:style w:type="table" w:default="1" w:styleId="TableNormal">

</xml_diff>